<commit_message>
Aggiornamenti Applicati di "NOTE SU SITO.docx"
</commit_message>
<xml_diff>
--- a/NOTE SU SITO.docx
+++ b/NOTE SU SITO.docx
@@ -1,6 +1,6 @@
 
 <file path=word/document.xml><?xml version="1.0" encoding="utf-8"?>
-<w:document xmlns:wpc="http://schemas.microsoft.com/office/word/2010/wordprocessingCanvas" xmlns:cx="http://schemas.microsoft.com/office/drawing/2014/chartex" xmlns:cx1="http://schemas.microsoft.com/office/drawing/2015/9/8/chartex" xmlns:cx2="http://schemas.microsoft.com/office/drawing/2015/10/21/chartex" xmlns:cx3="http://schemas.microsoft.com/office/drawing/2016/5/9/chartex" xmlns:cx4="http://schemas.microsoft.com/office/drawing/2016/5/10/chartex" xmlns:cx5="http://schemas.microsoft.com/office/drawing/2016/5/11/chartex" xmlns:cx6="http://schemas.microsoft.com/office/drawing/2016/5/12/chartex" xmlns:cx7="http://schemas.microsoft.com/office/drawing/2016/5/13/chartex" xmlns:cx8="http://schemas.microsoft.com/office/drawing/2016/5/14/chartex" xmlns:mc="http://schemas.openxmlformats.org/markup-compatibility/2006" xmlns:aink="http://schemas.microsoft.com/office/drawing/2016/ink" xmlns:am3d="http://schemas.microsoft.com/office/drawing/2017/model3d" xmlns:o="urn:schemas-microsoft-com:office:office" xmlns:oel="http://schemas.microsoft.com/office/2019/extlst" xmlns:r="http://schemas.openxmlformats.org/officeDocument/2006/relationships" xmlns:m="http://schemas.openxmlformats.org/officeDocument/2006/math" xmlns:v="urn:schemas-microsoft-com:vml" xmlns:wp14="http://schemas.microsoft.com/office/word/2010/wordprocessingDrawing" xmlns:wp="http://schemas.openxmlformats.org/drawingml/2006/wordprocessingDrawing" xmlns:w10="urn:schemas-microsoft-com:office:word" xmlns:w="http://schemas.openxmlformats.org/wordprocessingml/2006/main" xmlns:w14="http://schemas.microsoft.com/office/word/2010/wordml" xmlns:w15="http://schemas.microsoft.com/office/word/2012/wordml" xmlns:w16cex="http://schemas.microsoft.com/office/word/2018/wordml/cex" xmlns:w16cid="http://schemas.microsoft.com/office/word/2016/wordml/cid" xmlns:w16="http://schemas.microsoft.com/office/word/2018/wordml" xmlns:w16sdtdh="http://schemas.microsoft.com/office/word/2020/wordml/sdtdatahash" xmlns:w16se="http://schemas.microsoft.com/office/word/2015/wordml/symex" xmlns:wpg="http://schemas.microsoft.com/office/word/2010/wordprocessingGroup" xmlns:wpi="http://schemas.microsoft.com/office/word/2010/wordprocessingInk" xmlns:wne="http://schemas.microsoft.com/office/word/2006/wordml" xmlns:wps="http://schemas.microsoft.com/office/word/2010/wordprocessingShape" mc:Ignorable="w14 w15 w16se w16cid w16 w16cex w16sdtdh wp14">
+<w:document xmlns:wpc="http://schemas.microsoft.com/office/word/2010/wordprocessingCanvas" xmlns:cx="http://schemas.microsoft.com/office/drawing/2014/chartex" xmlns:cx1="http://schemas.microsoft.com/office/drawing/2015/9/8/chartex" xmlns:cx2="http://schemas.microsoft.com/office/drawing/2015/10/21/chartex" xmlns:cx3="http://schemas.microsoft.com/office/drawing/2016/5/9/chartex" xmlns:cx4="http://schemas.microsoft.com/office/drawing/2016/5/10/chartex" xmlns:cx5="http://schemas.microsoft.com/office/drawing/2016/5/11/chartex" xmlns:cx6="http://schemas.microsoft.com/office/drawing/2016/5/12/chartex" xmlns:cx7="http://schemas.microsoft.com/office/drawing/2016/5/13/chartex" xmlns:cx8="http://schemas.microsoft.com/office/drawing/2016/5/14/chartex" xmlns:mc="http://schemas.openxmlformats.org/markup-compatibility/2006" xmlns:aink="http://schemas.microsoft.com/office/drawing/2016/ink" xmlns:am3d="http://schemas.microsoft.com/office/drawing/2017/model3d" xmlns:o="urn:schemas-microsoft-com:office:office" xmlns:oel="http://schemas.microsoft.com/office/2019/extlst" xmlns:r="http://schemas.openxmlformats.org/officeDocument/2006/relationships" xmlns:m="http://schemas.openxmlformats.org/officeDocument/2006/math" xmlns:v="urn:schemas-microsoft-com:vml" xmlns:wp14="http://schemas.microsoft.com/office/word/2010/wordprocessingDrawing" xmlns:wp="http://schemas.openxmlformats.org/drawingml/2006/wordprocessingDrawing" xmlns:w10="urn:schemas-microsoft-com:office:word" xmlns:w="http://schemas.openxmlformats.org/wordprocessingml/2006/main" xmlns:w14="http://schemas.microsoft.com/office/word/2010/wordml" xmlns:w15="http://schemas.microsoft.com/office/word/2012/wordml" xmlns:w16cex="http://schemas.microsoft.com/office/word/2018/wordml/cex" xmlns:w16cid="http://schemas.microsoft.com/office/word/2016/wordml/cid" xmlns:w16="http://schemas.microsoft.com/office/word/2018/wordml" xmlns:w16du="http://schemas.microsoft.com/office/word/2023/wordml/word16du" xmlns:w16sdtdh="http://schemas.microsoft.com/office/word/2020/wordml/sdtdatahash" xmlns:w16sdtfl="http://schemas.microsoft.com/office/word/2024/wordml/sdtformatlock" xmlns:w16se="http://schemas.microsoft.com/office/word/2015/wordml/symex" xmlns:wpg="http://schemas.microsoft.com/office/word/2010/wordprocessingGroup" xmlns:wpi="http://schemas.microsoft.com/office/word/2010/wordprocessingInk" xmlns:wne="http://schemas.microsoft.com/office/word/2006/wordml" xmlns:wps="http://schemas.microsoft.com/office/word/2010/wordprocessingShape" mc:Ignorable="w14 w15 w16se w16cid w16 w16cex w16sdtdh w16sdtfl w16du wp14">
   <w:body>
     <w:p>
       <w:pPr>
@@ -35,7 +35,7 @@
     </w:p>
     <w:p>
       <w:pPr>
-        <w:pStyle w:val="Paragrafoelenco"/>
+        <w:pStyle w:val="ListParagraph"/>
         <w:numPr>
           <w:ilvl w:val="0"/>
           <w:numId w:val="2"/>
@@ -56,7 +56,7 @@
     </w:p>
     <w:p>
       <w:pPr>
-        <w:pStyle w:val="Paragrafoelenco"/>
+        <w:pStyle w:val="ListParagraph"/>
         <w:numPr>
           <w:ilvl w:val="0"/>
           <w:numId w:val="2"/>
@@ -90,7 +90,7 @@
     </w:p>
     <w:p>
       <w:pPr>
-        <w:pStyle w:val="Paragrafoelenco"/>
+        <w:pStyle w:val="ListParagraph"/>
         <w:numPr>
           <w:ilvl w:val="0"/>
           <w:numId w:val="2"/>
@@ -99,10 +99,13 @@
       <w:r>
         <w:t xml:space="preserve">NELLA MAPPA INSERIRE LE SEDI DELL’ISTITUTO  </w:t>
       </w:r>
-    </w:p>
-    <w:p>
-      <w:pPr>
-        <w:pStyle w:val="Paragrafoelenco"/>
+      <w:r>
+        <w:t>(CON ICONE PERSONALIZZATE)</w:t>
+      </w:r>
+    </w:p>
+    <w:p>
+      <w:pPr>
+        <w:pStyle w:val="ListParagraph"/>
         <w:numPr>
           <w:ilvl w:val="0"/>
           <w:numId w:val="2"/>
@@ -129,7 +132,7 @@
     </w:p>
     <w:p>
       <w:pPr>
-        <w:pStyle w:val="Paragrafoelenco"/>
+        <w:pStyle w:val="ListParagraph"/>
         <w:numPr>
           <w:ilvl w:val="0"/>
           <w:numId w:val="1"/>
@@ -144,7 +147,7 @@
     </w:p>
     <w:p>
       <w:pPr>
-        <w:pStyle w:val="Paragrafoelenco"/>
+        <w:pStyle w:val="ListParagraph"/>
       </w:pPr>
     </w:p>
     <w:p>
@@ -246,7 +249,7 @@
     </w:p>
     <w:p>
       <w:pPr>
-        <w:pStyle w:val="Titolo3"/>
+        <w:pStyle w:val="Heading3"/>
         <w:shd w:val="clear" w:color="auto" w:fill="FFFFFF"/>
         <w:spacing w:before="0" w:beforeAutospacing="0" w:after="300" w:afterAutospacing="0"/>
         <w:rPr>
@@ -279,7 +282,7 @@
     </w:p>
     <w:p>
       <w:pPr>
-        <w:pStyle w:val="NormaleWeb"/>
+        <w:pStyle w:val="NormalWeb"/>
         <w:shd w:val="clear" w:color="auto" w:fill="FFFFFF"/>
         <w:spacing w:before="0" w:beforeAutospacing="0" w:after="225" w:afterAutospacing="0"/>
         <w:rPr>
@@ -315,25 +318,7 @@
           <w:sz w:val="27"/>
           <w:szCs w:val="27"/>
         </w:rPr>
-        <w:t xml:space="preserve"> </w:t>
-      </w:r>
-      <w:r>
-        <w:rPr>
-          <w:rFonts w:ascii="Arial" w:hAnsi="Arial" w:cs="Arial"/>
-          <w:color w:val="6B7280"/>
-          <w:sz w:val="27"/>
-          <w:szCs w:val="27"/>
-        </w:rPr>
-        <w:t>4 ettari di estensione, Pietra Cappa è il monolite più alto d'Europa</w:t>
-      </w:r>
-      <w:r>
-        <w:rPr>
-          <w:rFonts w:ascii="Arial" w:hAnsi="Arial" w:cs="Arial"/>
-          <w:color w:val="6B7280"/>
-          <w:sz w:val="27"/>
-          <w:szCs w:val="27"/>
-        </w:rPr>
-        <w:t xml:space="preserve"> </w:t>
+        <w:t xml:space="preserve"> 4 ettari di estensione, Pietra Cappa è il monolite più alto d'Europa </w:t>
       </w:r>
       <w:r>
         <w:rPr>
@@ -342,48 +327,21 @@
           <w:sz w:val="27"/>
           <w:szCs w:val="27"/>
         </w:rPr>
-        <w:t>NO s</w:t>
-      </w:r>
-      <w:r>
-        <w:rPr>
-          <w:rFonts w:ascii="Arial" w:hAnsi="Arial" w:cs="Arial"/>
-          <w:color w:val="FF0000"/>
-          <w:sz w:val="27"/>
-          <w:szCs w:val="27"/>
-        </w:rPr>
-        <w:t>imbolo del Parco Nazionale dell'Aspromonte e</w:t>
-      </w:r>
-      <w:r>
-        <w:rPr>
-          <w:rFonts w:ascii="Arial" w:hAnsi="Arial" w:cs="Arial"/>
-          <w:color w:val="6B7280"/>
-          <w:sz w:val="27"/>
-          <w:szCs w:val="27"/>
-        </w:rPr>
-        <w:t xml:space="preserve"> </w:t>
-      </w:r>
-      <w:r>
-        <w:rPr>
-          <w:rFonts w:ascii="Arial" w:hAnsi="Arial" w:cs="Arial"/>
-          <w:color w:val="6B7280"/>
-          <w:sz w:val="27"/>
-          <w:szCs w:val="27"/>
-        </w:rPr>
-        <w:t xml:space="preserve">nel </w:t>
-      </w:r>
-      <w:r>
-        <w:rPr>
-          <w:rFonts w:ascii="Arial" w:hAnsi="Arial" w:cs="Arial"/>
-          <w:color w:val="6B7280"/>
-          <w:sz w:val="27"/>
-          <w:szCs w:val="27"/>
-        </w:rPr>
-        <w:t>cuore della Valle delle Grandi Pietre. La sua imponente forma tondeggiante a "panettone" contrasta con la morfologia selvaggia dell'Aspromonte, spiccando nel verde dei boschi circostanti.</w:t>
-      </w:r>
-    </w:p>
-    <w:p>
-      <w:pPr>
-        <w:pStyle w:val="NormaleWeb"/>
+        <w:t>NO simbolo del Parco Nazionale dell'Aspromonte e</w:t>
+      </w:r>
+      <w:r>
+        <w:rPr>
+          <w:rFonts w:ascii="Arial" w:hAnsi="Arial" w:cs="Arial"/>
+          <w:color w:val="6B7280"/>
+          <w:sz w:val="27"/>
+          <w:szCs w:val="27"/>
+        </w:rPr>
+        <w:t xml:space="preserve"> nel cuore della Valle delle Grandi Pietre. La sua imponente forma tondeggiante a "panettone" contrasta con la morfologia selvaggia dell'Aspromonte, spiccando nel verde dei boschi circostanti.</w:t>
+      </w:r>
+    </w:p>
+    <w:p>
+      <w:pPr>
+        <w:pStyle w:val="NormalWeb"/>
         <w:shd w:val="clear" w:color="auto" w:fill="FFFFFF"/>
         <w:spacing w:before="0" w:beforeAutospacing="0" w:after="225" w:afterAutospacing="0"/>
         <w:jc w:val="both"/>
@@ -438,25 +396,7 @@
           <w:sz w:val="27"/>
           <w:szCs w:val="27"/>
         </w:rPr>
-        <w:t xml:space="preserve"> </w:t>
-      </w:r>
-      <w:r>
-        <w:rPr>
-          <w:rFonts w:ascii="Arial" w:hAnsi="Arial" w:cs="Arial"/>
-          <w:color w:val="6B7280"/>
-          <w:sz w:val="27"/>
-          <w:szCs w:val="27"/>
-        </w:rPr>
-        <w:t>geologica: conglomerati e arenarie ben cementati risalenti all'Oligocene (33-23 milioni di anni fa). Pietra Cappa</w:t>
-      </w:r>
-      <w:r>
-        <w:rPr>
-          <w:rFonts w:ascii="Arial" w:hAnsi="Arial" w:cs="Arial"/>
-          <w:color w:val="6B7280"/>
-          <w:sz w:val="27"/>
-          <w:szCs w:val="27"/>
-        </w:rPr>
-        <w:t xml:space="preserve">, </w:t>
+        <w:t xml:space="preserve"> geologica: conglomerati e arenarie ben cementati risalenti all'Oligocene (33-23 milioni di anni fa). Pietra Cappa, </w:t>
       </w:r>
       <w:r>
         <w:rPr>
@@ -488,22 +428,41 @@
           <w:szCs w:val="27"/>
           <w:highlight w:val="yellow"/>
         </w:rPr>
-        <w:t xml:space="preserve"> </w:t>
-      </w:r>
-      <w:r>
-        <w:rPr>
-          <w:rFonts w:ascii="Arial" w:hAnsi="Arial" w:cs="Arial"/>
-          <w:color w:val="6B7280"/>
-          <w:sz w:val="27"/>
-          <w:szCs w:val="27"/>
-          <w:highlight w:val="yellow"/>
-        </w:rPr>
-        <w:t>Aspromonte</w:t>
-      </w:r>
-      <w:r>
-        <w:rPr>
-          <w:rFonts w:ascii="Arial" w:hAnsi="Arial" w:cs="Arial"/>
-          <w:color w:val="6B7280"/>
+        <w:t xml:space="preserve"> Aspromonte</w:t>
+      </w:r>
+      <w:r>
+        <w:rPr>
+          <w:rFonts w:ascii="Arial" w:hAnsi="Arial" w:cs="Arial"/>
+          <w:color w:val="6B7280"/>
+          <w:sz w:val="27"/>
+          <w:szCs w:val="27"/>
+        </w:rPr>
+        <w:t xml:space="preserve">, è un geosito di rilevanza internazionale, </w:t>
+      </w:r>
+      <w:r>
+        <w:rPr>
+          <w:rFonts w:ascii="Arial" w:hAnsi="Arial" w:cs="Arial"/>
+          <w:color w:val="FF0000"/>
+          <w:sz w:val="27"/>
+          <w:szCs w:val="27"/>
+        </w:rPr>
+        <w:t xml:space="preserve">NO incluso nell'Aspromonte </w:t>
+      </w:r>
+      <w:proofErr w:type="spellStart"/>
+      <w:r>
+        <w:rPr>
+          <w:rFonts w:ascii="Arial" w:hAnsi="Arial" w:cs="Arial"/>
+          <w:color w:val="FF0000"/>
+          <w:sz w:val="27"/>
+          <w:szCs w:val="27"/>
+        </w:rPr>
+        <w:t>Geopark</w:t>
+      </w:r>
+      <w:proofErr w:type="spellEnd"/>
+      <w:r>
+        <w:rPr>
+          <w:rFonts w:ascii="Arial" w:hAnsi="Arial" w:cs="Arial"/>
+          <w:color w:val="FF0000"/>
           <w:sz w:val="27"/>
           <w:szCs w:val="27"/>
         </w:rPr>
@@ -516,94 +475,7 @@
           <w:sz w:val="27"/>
           <w:szCs w:val="27"/>
         </w:rPr>
-        <w:t xml:space="preserve"> è un </w:t>
-      </w:r>
-      <w:proofErr w:type="spellStart"/>
-      <w:r>
-        <w:rPr>
-          <w:rFonts w:ascii="Arial" w:hAnsi="Arial" w:cs="Arial"/>
-          <w:color w:val="6B7280"/>
-          <w:sz w:val="27"/>
-          <w:szCs w:val="27"/>
-        </w:rPr>
-        <w:t>geosito</w:t>
-      </w:r>
-      <w:proofErr w:type="spellEnd"/>
-      <w:r>
-        <w:rPr>
-          <w:rFonts w:ascii="Arial" w:hAnsi="Arial" w:cs="Arial"/>
-          <w:color w:val="6B7280"/>
-          <w:sz w:val="27"/>
-          <w:szCs w:val="27"/>
-        </w:rPr>
-        <w:t xml:space="preserve"> di rilevanza internazionale, </w:t>
-      </w:r>
-      <w:r>
-        <w:rPr>
-          <w:rFonts w:ascii="Arial" w:hAnsi="Arial" w:cs="Arial"/>
-          <w:color w:val="FF0000"/>
-          <w:sz w:val="27"/>
-          <w:szCs w:val="27"/>
-        </w:rPr>
-        <w:t xml:space="preserve">NO </w:t>
-      </w:r>
-      <w:r>
-        <w:rPr>
-          <w:rFonts w:ascii="Arial" w:hAnsi="Arial" w:cs="Arial"/>
-          <w:color w:val="FF0000"/>
-          <w:sz w:val="27"/>
-          <w:szCs w:val="27"/>
-        </w:rPr>
-        <w:t xml:space="preserve">incluso nell'Aspromonte </w:t>
-      </w:r>
-      <w:proofErr w:type="spellStart"/>
-      <w:r>
-        <w:rPr>
-          <w:rFonts w:ascii="Arial" w:hAnsi="Arial" w:cs="Arial"/>
-          <w:color w:val="FF0000"/>
-          <w:sz w:val="27"/>
-          <w:szCs w:val="27"/>
-        </w:rPr>
-        <w:t>Geopark</w:t>
-      </w:r>
-      <w:proofErr w:type="spellEnd"/>
-      <w:r>
-        <w:rPr>
-          <w:rFonts w:ascii="Arial" w:hAnsi="Arial" w:cs="Arial"/>
-          <w:color w:val="FF0000"/>
-          <w:sz w:val="27"/>
-          <w:szCs w:val="27"/>
-        </w:rPr>
-        <w:t>,</w:t>
-      </w:r>
-      <w:r>
-        <w:rPr>
-          <w:rFonts w:ascii="Arial" w:hAnsi="Arial" w:cs="Arial"/>
-          <w:color w:val="6B7280"/>
-          <w:sz w:val="27"/>
-          <w:szCs w:val="27"/>
-        </w:rPr>
-        <w:t xml:space="preserve"> inserito nella Rete Globale dei </w:t>
-      </w:r>
-      <w:proofErr w:type="spellStart"/>
-      <w:r>
-        <w:rPr>
-          <w:rFonts w:ascii="Arial" w:hAnsi="Arial" w:cs="Arial"/>
-          <w:color w:val="6B7280"/>
-          <w:sz w:val="27"/>
-          <w:szCs w:val="27"/>
-        </w:rPr>
-        <w:t>Geoparchi</w:t>
-      </w:r>
-      <w:proofErr w:type="spellEnd"/>
-      <w:r>
-        <w:rPr>
-          <w:rFonts w:ascii="Arial" w:hAnsi="Arial" w:cs="Arial"/>
-          <w:color w:val="6B7280"/>
-          <w:sz w:val="27"/>
-          <w:szCs w:val="27"/>
-        </w:rPr>
-        <w:t xml:space="preserve"> UNESCO.</w:t>
+        <w:t xml:space="preserve"> inserito nella Rete Globale dei Geoparchi UNESCO.</w:t>
       </w:r>
     </w:p>
     <w:p>
@@ -674,62 +546,7 @@
           <w:lang w:eastAsia="it-IT"/>
           <w14:ligatures w14:val="none"/>
         </w:rPr>
-        <w:t>Il nome "Pietra Cappa" ha origini antichissime</w:t>
-      </w:r>
-      <w:r>
-        <w:rPr>
-          <w:rFonts w:ascii="Arial" w:eastAsia="Times New Roman" w:hAnsi="Arial" w:cs="Arial"/>
-          <w:kern w:val="0"/>
-          <w:sz w:val="27"/>
-          <w:szCs w:val="27"/>
-          <w:lang w:eastAsia="it-IT"/>
-          <w14:ligatures w14:val="none"/>
-        </w:rPr>
-        <w:t>,</w:t>
-      </w:r>
-      <w:r>
-        <w:rPr>
-          <w:rFonts w:ascii="Arial" w:eastAsia="Times New Roman" w:hAnsi="Arial" w:cs="Arial"/>
-          <w:kern w:val="0"/>
-          <w:sz w:val="27"/>
-          <w:szCs w:val="27"/>
-          <w:lang w:eastAsia="it-IT"/>
-          <w14:ligatures w14:val="none"/>
-        </w:rPr>
-        <w:t xml:space="preserve"> </w:t>
-      </w:r>
-      <w:r>
-        <w:rPr>
-          <w:rFonts w:ascii="Arial" w:eastAsia="Times New Roman" w:hAnsi="Arial" w:cs="Arial"/>
-          <w:kern w:val="0"/>
-          <w:sz w:val="27"/>
-          <w:szCs w:val="27"/>
-          <w:lang w:eastAsia="it-IT"/>
-          <w14:ligatures w14:val="none"/>
-        </w:rPr>
-        <w:t>S</w:t>
-      </w:r>
-      <w:r>
-        <w:rPr>
-          <w:rFonts w:ascii="Arial" w:eastAsia="Times New Roman" w:hAnsi="Arial" w:cs="Arial"/>
-          <w:kern w:val="0"/>
-          <w:sz w:val="27"/>
-          <w:szCs w:val="27"/>
-          <w:lang w:eastAsia="it-IT"/>
-          <w14:ligatures w14:val="none"/>
-        </w:rPr>
-        <w:t>ignifica "coppa rovesciata"</w:t>
-      </w:r>
-      <w:r>
-        <w:rPr>
-          <w:rFonts w:ascii="Arial" w:eastAsia="Times New Roman" w:hAnsi="Arial" w:cs="Arial"/>
-          <w:kern w:val="0"/>
-          <w:sz w:val="27"/>
-          <w:szCs w:val="27"/>
-          <w:lang w:eastAsia="it-IT"/>
-          <w14:ligatures w14:val="none"/>
-        </w:rPr>
-        <w:t>.</w:t>
+        <w:t>Il nome "Pietra Cappa" ha origini antichissime, Significa "coppa rovesciata".</w:t>
       </w:r>
       <w:r>
         <w:rPr>
@@ -819,7 +636,7 @@
     <w:p/>
     <w:p>
       <w:pPr>
-        <w:pStyle w:val="Titolo3"/>
+        <w:pStyle w:val="Heading3"/>
         <w:shd w:val="clear" w:color="auto" w:fill="FAFBFC"/>
         <w:spacing w:before="0" w:beforeAutospacing="0" w:after="300" w:afterAutospacing="0"/>
         <w:rPr>
@@ -838,7 +655,7 @@
     </w:p>
     <w:p>
       <w:pPr>
-        <w:pStyle w:val="Titolo3"/>
+        <w:pStyle w:val="Heading3"/>
         <w:shd w:val="clear" w:color="auto" w:fill="FAFBFC"/>
         <w:spacing w:before="0" w:beforeAutospacing="0" w:after="300" w:afterAutospacing="0"/>
         <w:rPr>
@@ -857,7 +674,7 @@
     </w:p>
     <w:p>
       <w:pPr>
-        <w:pStyle w:val="Titolo3"/>
+        <w:pStyle w:val="Heading3"/>
         <w:shd w:val="clear" w:color="auto" w:fill="FAFBFC"/>
         <w:spacing w:before="0" w:beforeAutospacing="0" w:after="300" w:afterAutospacing="0"/>
         <w:rPr>
@@ -875,7 +692,7 @@
     </w:p>
     <w:p>
       <w:pPr>
-        <w:pStyle w:val="Titolo3"/>
+        <w:pStyle w:val="Heading3"/>
         <w:shd w:val="clear" w:color="auto" w:fill="FAFBFC"/>
         <w:spacing w:before="0" w:beforeAutospacing="0" w:after="300" w:afterAutospacing="0"/>
         <w:rPr>
@@ -910,7 +727,7 @@
     </w:p>
     <w:p>
       <w:pPr>
-        <w:pStyle w:val="Titolo3"/>
+        <w:pStyle w:val="Heading3"/>
         <w:shd w:val="clear" w:color="auto" w:fill="FAFBFC"/>
         <w:spacing w:before="0" w:beforeAutospacing="0" w:after="300" w:afterAutospacing="0"/>
         <w:rPr>
@@ -928,7 +745,7 @@
     </w:p>
     <w:p>
       <w:pPr>
-        <w:pStyle w:val="NormaleWeb"/>
+        <w:pStyle w:val="NormalWeb"/>
         <w:shd w:val="clear" w:color="auto" w:fill="FAFBFC"/>
         <w:spacing w:before="0" w:beforeAutospacing="0" w:after="0" w:afterAutospacing="0"/>
         <w:rPr>
@@ -940,7 +757,7 @@
       </w:pPr>
       <w:r>
         <w:rPr>
-          <w:rStyle w:val="Enfasigrassetto"/>
+          <w:rStyle w:val="Strong"/>
           <w:rFonts w:ascii="Arial" w:hAnsi="Arial" w:cs="Arial"/>
           <w:color w:val="6B7280"/>
           <w:sz w:val="27"/>
@@ -968,7 +785,7 @@
       </w:r>
       <w:r>
         <w:rPr>
-          <w:rStyle w:val="Enfasigrassetto"/>
+          <w:rStyle w:val="Strong"/>
           <w:rFonts w:ascii="Arial" w:hAnsi="Arial" w:cs="Arial"/>
           <w:color w:val="6B7280"/>
           <w:sz w:val="27"/>
@@ -996,7 +813,7 @@
       </w:r>
       <w:r>
         <w:rPr>
-          <w:rStyle w:val="Enfasigrassetto"/>
+          <w:rStyle w:val="Strong"/>
           <w:rFonts w:ascii="Arial" w:hAnsi="Arial" w:cs="Arial"/>
           <w:color w:val="6B7280"/>
           <w:sz w:val="27"/>
@@ -1024,7 +841,7 @@
       </w:r>
       <w:r>
         <w:rPr>
-          <w:rStyle w:val="Enfasigrassetto"/>
+          <w:rStyle w:val="Strong"/>
           <w:rFonts w:ascii="Arial" w:hAnsi="Arial" w:cs="Arial"/>
           <w:color w:val="6B7280"/>
           <w:sz w:val="27"/>
@@ -1052,7 +869,7 @@
       </w:r>
       <w:r>
         <w:rPr>
-          <w:rStyle w:val="Enfasigrassetto"/>
+          <w:rStyle w:val="Strong"/>
           <w:rFonts w:ascii="Arial" w:hAnsi="Arial" w:cs="Arial"/>
           <w:color w:val="6B7280"/>
           <w:sz w:val="27"/>
@@ -1072,7 +889,7 @@
     </w:p>
     <w:p>
       <w:pPr>
-        <w:pStyle w:val="NormaleWeb"/>
+        <w:pStyle w:val="NormalWeb"/>
         <w:shd w:val="clear" w:color="auto" w:fill="FAFBFC"/>
         <w:spacing w:before="0" w:beforeAutospacing="0" w:after="225" w:afterAutospacing="0"/>
         <w:rPr>
@@ -1103,7 +920,7 @@
     </w:p>
     <w:p>
       <w:pPr>
-        <w:pStyle w:val="Titolo4"/>
+        <w:pStyle w:val="Heading4"/>
         <w:spacing w:before="0" w:after="150"/>
         <w:jc w:val="center"/>
         <w:rPr>
@@ -1136,7 +953,7 @@
     </w:p>
     <w:p>
       <w:pPr>
-        <w:pStyle w:val="Titolo4"/>
+        <w:pStyle w:val="Heading4"/>
         <w:spacing w:before="0" w:after="150"/>
         <w:jc w:val="center"/>
         <w:rPr>
@@ -1154,7 +971,7 @@
     </w:p>
     <w:p>
       <w:pPr>
-        <w:pStyle w:val="NormaleWeb"/>
+        <w:pStyle w:val="NormalWeb"/>
         <w:spacing w:before="0" w:beforeAutospacing="0" w:after="0" w:afterAutospacing="0"/>
         <w:jc w:val="center"/>
         <w:rPr>
@@ -1164,7 +981,7 @@
       </w:pPr>
       <w:r>
         <w:rPr>
-          <w:rStyle w:val="Enfasigrassetto"/>
+          <w:rStyle w:val="Strong"/>
           <w:rFonts w:ascii="Arial" w:hAnsi="Arial" w:cs="Arial"/>
           <w:color w:val="FF0000"/>
         </w:rPr>
@@ -1203,7 +1020,7 @@
       </w:r>
       <w:r>
         <w:rPr>
-          <w:rStyle w:val="Enfasigrassetto"/>
+          <w:rStyle w:val="Strong"/>
           <w:rFonts w:ascii="Arial" w:hAnsi="Arial" w:cs="Arial"/>
           <w:color w:val="FF0000"/>
         </w:rPr>
@@ -1225,7 +1042,7 @@
       </w:r>
       <w:r>
         <w:rPr>
-          <w:rStyle w:val="Enfasigrassetto"/>
+          <w:rStyle w:val="Strong"/>
           <w:rFonts w:ascii="Arial" w:hAnsi="Arial" w:cs="Arial"/>
           <w:color w:val="FF0000"/>
         </w:rPr>
@@ -1249,7 +1066,7 @@
     </w:p>
     <w:p>
       <w:pPr>
-        <w:pStyle w:val="Titolo3"/>
+        <w:pStyle w:val="Heading3"/>
         <w:shd w:val="clear" w:color="auto" w:fill="FAFBFC"/>
         <w:spacing w:before="0" w:beforeAutospacing="0" w:after="300" w:afterAutospacing="0"/>
         <w:rPr>
@@ -1285,7 +1102,7 @@
     </w:p>
     <w:p>
       <w:pPr>
-        <w:pStyle w:val="Titolo3"/>
+        <w:pStyle w:val="Heading3"/>
         <w:shd w:val="clear" w:color="auto" w:fill="FFFFFF"/>
         <w:spacing w:before="0" w:beforeAutospacing="0" w:after="300" w:afterAutospacing="0"/>
         <w:rPr>
@@ -1303,7 +1120,7 @@
     </w:p>
     <w:p>
       <w:pPr>
-        <w:pStyle w:val="Titolo3"/>
+        <w:pStyle w:val="Heading3"/>
         <w:shd w:val="clear" w:color="auto" w:fill="FFFFFF"/>
         <w:spacing w:before="0" w:beforeAutospacing="0" w:after="300" w:afterAutospacing="0"/>
         <w:rPr>
@@ -1393,7 +1210,7 @@
     </w:p>
     <w:p>
       <w:pPr>
-        <w:pStyle w:val="Titolo2"/>
+        <w:pStyle w:val="Heading2"/>
         <w:shd w:val="clear" w:color="auto" w:fill="FAFBFC"/>
         <w:spacing w:before="0" w:after="360"/>
         <w:jc w:val="center"/>
@@ -1448,7 +1265,7 @@
     </w:p>
     <w:p>
       <w:pPr>
-        <w:pStyle w:val="NormaleWeb"/>
+        <w:pStyle w:val="NormalWeb"/>
         <w:shd w:val="clear" w:color="auto" w:fill="FAFBFC"/>
         <w:spacing w:before="0" w:beforeAutospacing="0" w:after="600" w:afterAutospacing="0"/>
         <w:jc w:val="center"/>
@@ -1462,28 +1279,7 @@
           <w:rFonts w:ascii="Arial" w:hAnsi="Arial" w:cs="Arial"/>
           <w:color w:val="FF0000"/>
         </w:rPr>
-        <w:t xml:space="preserve">NO </w:t>
-      </w:r>
-      <w:r>
-        <w:rPr>
-          <w:rFonts w:ascii="Arial" w:hAnsi="Arial" w:cs="Arial"/>
-          <w:color w:val="FF0000"/>
-        </w:rPr>
-        <w:t>Città natale del celebre regista e attore</w:t>
-      </w:r>
-      <w:r>
-        <w:rPr>
-          <w:rFonts w:ascii="Arial" w:hAnsi="Arial" w:cs="Arial"/>
-          <w:color w:val="FF0000"/>
-        </w:rPr>
-        <w:t xml:space="preserve"> </w:t>
-      </w:r>
-      <w:r>
-        <w:rPr>
-          <w:rFonts w:ascii="Arial" w:hAnsi="Arial" w:cs="Arial"/>
-          <w:color w:val="FF0000"/>
-        </w:rPr>
-        <w:t>Spiagge dorate e tradizioni legate al mare.</w:t>
+        <w:t>NO Città natale del celebre regista e attore Spiagge dorate e tradizioni legate al mare.</w:t>
       </w:r>
     </w:p>
     <w:p>
@@ -1631,7 +1427,7 @@
     </w:p>
     <w:p>
       <w:pPr>
-        <w:pStyle w:val="Paragrafoelenco"/>
+        <w:pStyle w:val="ListParagraph"/>
         <w:rPr>
           <w:b/>
           <w:bCs/>
@@ -1647,7 +1443,7 @@
     </w:p>
     <w:p>
       <w:pPr>
-        <w:pStyle w:val="Paragrafoelenco"/>
+        <w:pStyle w:val="ListParagraph"/>
         <w:rPr>
           <w:b/>
           <w:bCs/>
@@ -1663,16 +1459,16 @@
     </w:p>
     <w:p>
       <w:pPr>
-        <w:pStyle w:val="Paragrafoelenco"/>
-        <w:rPr>
-          <w:b/>
-          <w:bCs/>
-        </w:rPr>
-      </w:pPr>
-    </w:p>
-    <w:p>
-      <w:pPr>
-        <w:pStyle w:val="Paragrafoelenco"/>
+        <w:pStyle w:val="ListParagraph"/>
+        <w:rPr>
+          <w:b/>
+          <w:bCs/>
+        </w:rPr>
+      </w:pPr>
+    </w:p>
+    <w:p>
+      <w:pPr>
+        <w:pStyle w:val="ListParagraph"/>
       </w:pPr>
       <w:r>
         <w:t>RIMANGONO:</w:t>
@@ -1680,12 +1476,12 @@
     </w:p>
     <w:p>
       <w:pPr>
-        <w:pStyle w:val="Paragrafoelenco"/>
-      </w:pPr>
-    </w:p>
-    <w:p>
-      <w:pPr>
-        <w:pStyle w:val="Paragrafoelenco"/>
+        <w:pStyle w:val="ListParagraph"/>
+      </w:pPr>
+    </w:p>
+    <w:p>
+      <w:pPr>
+        <w:pStyle w:val="ListParagraph"/>
       </w:pPr>
       <w:r>
         <w:t>CAULONIA</w:t>
@@ -1693,7 +1489,7 @@
     </w:p>
     <w:p>
       <w:pPr>
-        <w:pStyle w:val="Paragrafoelenco"/>
+        <w:pStyle w:val="ListParagraph"/>
       </w:pPr>
       <w:r>
         <w:t>CIMINA’</w:t>
@@ -1701,7 +1497,7 @@
     </w:p>
     <w:p>
       <w:pPr>
-        <w:pStyle w:val="Paragrafoelenco"/>
+        <w:pStyle w:val="ListParagraph"/>
       </w:pPr>
       <w:r>
         <w:t>PLATI’</w:t>
@@ -1709,7 +1505,7 @@
     </w:p>
     <w:p>
       <w:pPr>
-        <w:pStyle w:val="Paragrafoelenco"/>
+        <w:pStyle w:val="ListParagraph"/>
       </w:pPr>
       <w:r>
         <w:t>RIACE</w:t>
@@ -1717,7 +1513,7 @@
     </w:p>
     <w:p>
       <w:pPr>
-        <w:pStyle w:val="Paragrafoelenco"/>
+        <w:pStyle w:val="ListParagraph"/>
       </w:pPr>
       <w:r>
         <w:t>ROCCELLA IONICA</w:t>
@@ -1725,7 +1521,7 @@
     </w:p>
     <w:p>
       <w:pPr>
-        <w:pStyle w:val="Paragrafoelenco"/>
+        <w:pStyle w:val="ListParagraph"/>
       </w:pPr>
       <w:r>
         <w:t>SIDERNO</w:t>
@@ -1740,6 +1536,146 @@
       </w:r>
       <w:r>
         <w:t>STILO</w:t>
+      </w:r>
+    </w:p>
+    <w:p>
+      <w:pPr>
+        <w:ind w:left="360"/>
+      </w:pPr>
+    </w:p>
+    <w:p>
+      <w:pPr>
+        <w:ind w:left="360"/>
+      </w:pPr>
+    </w:p>
+    <w:p>
+      <w:pPr>
+        <w:ind w:left="360"/>
+      </w:pPr>
+    </w:p>
+    <w:p>
+      <w:pPr>
+        <w:ind w:left="360"/>
+      </w:pPr>
+    </w:p>
+    <w:p>
+      <w:pPr>
+        <w:ind w:left="360"/>
+      </w:pPr>
+    </w:p>
+    <w:p>
+      <w:pPr>
+        <w:ind w:left="360"/>
+      </w:pPr>
+    </w:p>
+    <w:p>
+      <w:pPr>
+        <w:ind w:left="360"/>
+      </w:pPr>
+    </w:p>
+    <w:p>
+      <w:pPr>
+        <w:ind w:left="360"/>
+      </w:pPr>
+    </w:p>
+    <w:p>
+      <w:pPr>
+        <w:ind w:left="360"/>
+      </w:pPr>
+    </w:p>
+    <w:p>
+      <w:pPr>
+        <w:ind w:left="360"/>
+      </w:pPr>
+    </w:p>
+    <w:p>
+      <w:pPr>
+        <w:ind w:left="360"/>
+      </w:pPr>
+    </w:p>
+    <w:p>
+      <w:pPr>
+        <w:ind w:left="360"/>
+      </w:pPr>
+    </w:p>
+    <w:p>
+      <w:pPr>
+        <w:ind w:left="360"/>
+      </w:pPr>
+    </w:p>
+    <w:p>
+      <w:pPr>
+        <w:ind w:left="360"/>
+      </w:pPr>
+    </w:p>
+    <w:p>
+      <w:pPr>
+        <w:ind w:left="360"/>
+      </w:pPr>
+    </w:p>
+    <w:p>
+      <w:pPr>
+        <w:ind w:left="360"/>
+      </w:pPr>
+    </w:p>
+    <w:p>
+      <w:pPr>
+        <w:ind w:left="360"/>
+      </w:pPr>
+    </w:p>
+    <w:p>
+      <w:pPr>
+        <w:ind w:left="360"/>
+      </w:pPr>
+    </w:p>
+    <w:p>
+      <w:pPr>
+        <w:ind w:left="360"/>
+      </w:pPr>
+    </w:p>
+    <w:p>
+      <w:pPr>
+        <w:ind w:left="360"/>
+      </w:pPr>
+    </w:p>
+    <w:p>
+      <w:pPr>
+        <w:ind w:left="360"/>
+      </w:pPr>
+    </w:p>
+    <w:p>
+      <w:pPr>
+        <w:ind w:left="360"/>
+      </w:pPr>
+    </w:p>
+    <w:p>
+      <w:pPr>
+        <w:ind w:left="360"/>
+      </w:pPr>
+    </w:p>
+    <w:p>
+      <w:pPr>
+        <w:ind w:left="360"/>
+      </w:pPr>
+    </w:p>
+    <w:p>
+      <w:pPr>
+        <w:ind w:left="360"/>
+      </w:pPr>
+    </w:p>
+    <w:p>
+      <w:pPr>
+        <w:ind w:left="360"/>
+      </w:pPr>
+    </w:p>
+    <w:p>
+      <w:pPr>
+        <w:ind w:left="360"/>
+      </w:pPr>
+    </w:p>
+    <w:p>
+      <w:r>
+        <w:t xml:space="preserve"> </w:t>
       </w:r>
     </w:p>
     <w:sectPr>
@@ -1753,7 +1689,7 @@
 </file>
 
 <file path=word/numbering.xml><?xml version="1.0" encoding="utf-8"?>
-<w:numbering xmlns:wpc="http://schemas.microsoft.com/office/word/2010/wordprocessingCanvas" xmlns:cx="http://schemas.microsoft.com/office/drawing/2014/chartex" xmlns:cx1="http://schemas.microsoft.com/office/drawing/2015/9/8/chartex" xmlns:cx2="http://schemas.microsoft.com/office/drawing/2015/10/21/chartex" xmlns:cx3="http://schemas.microsoft.com/office/drawing/2016/5/9/chartex" xmlns:cx4="http://schemas.microsoft.com/office/drawing/2016/5/10/chartex" xmlns:cx5="http://schemas.microsoft.com/office/drawing/2016/5/11/chartex" xmlns:cx6="http://schemas.microsoft.com/office/drawing/2016/5/12/chartex" xmlns:cx7="http://schemas.microsoft.com/office/drawing/2016/5/13/chartex" xmlns:cx8="http://schemas.microsoft.com/office/drawing/2016/5/14/chartex" xmlns:mc="http://schemas.openxmlformats.org/markup-compatibility/2006" xmlns:aink="http://schemas.microsoft.com/office/drawing/2016/ink" xmlns:am3d="http://schemas.microsoft.com/office/drawing/2017/model3d" xmlns:o="urn:schemas-microsoft-com:office:office" xmlns:oel="http://schemas.microsoft.com/office/2019/extlst" xmlns:r="http://schemas.openxmlformats.org/officeDocument/2006/relationships" xmlns:m="http://schemas.openxmlformats.org/officeDocument/2006/math" xmlns:v="urn:schemas-microsoft-com:vml" xmlns:wp14="http://schemas.microsoft.com/office/word/2010/wordprocessingDrawing" xmlns:wp="http://schemas.openxmlformats.org/drawingml/2006/wordprocessingDrawing" xmlns:w10="urn:schemas-microsoft-com:office:word" xmlns:w="http://schemas.openxmlformats.org/wordprocessingml/2006/main" xmlns:w14="http://schemas.microsoft.com/office/word/2010/wordml" xmlns:w15="http://schemas.microsoft.com/office/word/2012/wordml" xmlns:w16cex="http://schemas.microsoft.com/office/word/2018/wordml/cex" xmlns:w16cid="http://schemas.microsoft.com/office/word/2016/wordml/cid" xmlns:w16="http://schemas.microsoft.com/office/word/2018/wordml" xmlns:w16sdtdh="http://schemas.microsoft.com/office/word/2020/wordml/sdtdatahash" xmlns:w16se="http://schemas.microsoft.com/office/word/2015/wordml/symex" xmlns:wpg="http://schemas.microsoft.com/office/word/2010/wordprocessingGroup" xmlns:wpi="http://schemas.microsoft.com/office/word/2010/wordprocessingInk" xmlns:wne="http://schemas.microsoft.com/office/word/2006/wordml" xmlns:wps="http://schemas.microsoft.com/office/word/2010/wordprocessingShape" mc:Ignorable="w14 w15 w16se w16cid w16 w16cex w16sdtdh wp14">
+<w:numbering xmlns:wpc="http://schemas.microsoft.com/office/word/2010/wordprocessingCanvas" xmlns:cx="http://schemas.microsoft.com/office/drawing/2014/chartex" xmlns:cx1="http://schemas.microsoft.com/office/drawing/2015/9/8/chartex" xmlns:cx2="http://schemas.microsoft.com/office/drawing/2015/10/21/chartex" xmlns:cx3="http://schemas.microsoft.com/office/drawing/2016/5/9/chartex" xmlns:cx4="http://schemas.microsoft.com/office/drawing/2016/5/10/chartex" xmlns:cx5="http://schemas.microsoft.com/office/drawing/2016/5/11/chartex" xmlns:cx6="http://schemas.microsoft.com/office/drawing/2016/5/12/chartex" xmlns:cx7="http://schemas.microsoft.com/office/drawing/2016/5/13/chartex" xmlns:cx8="http://schemas.microsoft.com/office/drawing/2016/5/14/chartex" xmlns:mc="http://schemas.openxmlformats.org/markup-compatibility/2006" xmlns:aink="http://schemas.microsoft.com/office/drawing/2016/ink" xmlns:am3d="http://schemas.microsoft.com/office/drawing/2017/model3d" xmlns:o="urn:schemas-microsoft-com:office:office" xmlns:oel="http://schemas.microsoft.com/office/2019/extlst" xmlns:r="http://schemas.openxmlformats.org/officeDocument/2006/relationships" xmlns:m="http://schemas.openxmlformats.org/officeDocument/2006/math" xmlns:v="urn:schemas-microsoft-com:vml" xmlns:wp14="http://schemas.microsoft.com/office/word/2010/wordprocessingDrawing" xmlns:wp="http://schemas.openxmlformats.org/drawingml/2006/wordprocessingDrawing" xmlns:w10="urn:schemas-microsoft-com:office:word" xmlns:w="http://schemas.openxmlformats.org/wordprocessingml/2006/main" xmlns:w14="http://schemas.microsoft.com/office/word/2010/wordml" xmlns:w15="http://schemas.microsoft.com/office/word/2012/wordml" xmlns:w16cex="http://schemas.microsoft.com/office/word/2018/wordml/cex" xmlns:w16cid="http://schemas.microsoft.com/office/word/2016/wordml/cid" xmlns:w16="http://schemas.microsoft.com/office/word/2018/wordml" xmlns:w16du="http://schemas.microsoft.com/office/word/2023/wordml/word16du" xmlns:w16sdtdh="http://schemas.microsoft.com/office/word/2020/wordml/sdtdatahash" xmlns:w16sdtfl="http://schemas.microsoft.com/office/word/2024/wordml/sdtformatlock" xmlns:w16se="http://schemas.microsoft.com/office/word/2015/wordml/symex" xmlns:wpg="http://schemas.microsoft.com/office/word/2010/wordprocessingGroup" xmlns:wpi="http://schemas.microsoft.com/office/word/2010/wordprocessingInk" xmlns:wne="http://schemas.microsoft.com/office/word/2006/wordml" xmlns:wps="http://schemas.microsoft.com/office/word/2010/wordprocessingShape" mc:Ignorable="w14 w15 w16se w16cid w16 w16cex w16sdtdh w16sdtfl w16du wp14">
   <w:abstractNum w:abstractNumId="0" w15:restartNumberingAfterBreak="0">
     <w:nsid w:val="1B500148"/>
     <w:multiLevelType w:val="hybridMultilevel"/>
@@ -1962,7 +1898,7 @@
 </file>
 
 <file path=word/styles.xml><?xml version="1.0" encoding="utf-8"?>
-<w:styles xmlns:mc="http://schemas.openxmlformats.org/markup-compatibility/2006" xmlns:r="http://schemas.openxmlformats.org/officeDocument/2006/relationships" xmlns:w="http://schemas.openxmlformats.org/wordprocessingml/2006/main" xmlns:w14="http://schemas.microsoft.com/office/word/2010/wordml" xmlns:w15="http://schemas.microsoft.com/office/word/2012/wordml" xmlns:w16cex="http://schemas.microsoft.com/office/word/2018/wordml/cex" xmlns:w16cid="http://schemas.microsoft.com/office/word/2016/wordml/cid" xmlns:w16="http://schemas.microsoft.com/office/word/2018/wordml" xmlns:w16sdtdh="http://schemas.microsoft.com/office/word/2020/wordml/sdtdatahash" xmlns:w16se="http://schemas.microsoft.com/office/word/2015/wordml/symex" mc:Ignorable="w14 w15 w16se w16cid w16 w16cex w16sdtdh">
+<w:styles xmlns:mc="http://schemas.openxmlformats.org/markup-compatibility/2006" xmlns:r="http://schemas.openxmlformats.org/officeDocument/2006/relationships" xmlns:w="http://schemas.openxmlformats.org/wordprocessingml/2006/main" xmlns:w14="http://schemas.microsoft.com/office/word/2010/wordml" xmlns:w15="http://schemas.microsoft.com/office/word/2012/wordml" xmlns:w16cex="http://schemas.microsoft.com/office/word/2018/wordml/cex" xmlns:w16cid="http://schemas.microsoft.com/office/word/2016/wordml/cid" xmlns:w16="http://schemas.microsoft.com/office/word/2018/wordml" xmlns:w16du="http://schemas.microsoft.com/office/word/2023/wordml/word16du" xmlns:w16sdtdh="http://schemas.microsoft.com/office/word/2020/wordml/sdtdatahash" xmlns:w16sdtfl="http://schemas.microsoft.com/office/word/2024/wordml/sdtformatlock" xmlns:w16se="http://schemas.microsoft.com/office/word/2015/wordml/symex" mc:Ignorable="w14 w15 w16se w16cid w16 w16cex w16sdtdh w16sdtfl w16du">
   <w:docDefaults>
     <w:rPrDefault>
       <w:rPr>
@@ -2354,15 +2290,15 @@
     <w:lsdException w:name="Unresolved Mention" w:semiHidden="1" w:unhideWhenUsed="1"/>
     <w:lsdException w:name="Smart Link" w:semiHidden="1" w:unhideWhenUsed="1"/>
   </w:latentStyles>
-  <w:style w:type="paragraph" w:default="1" w:styleId="Normale">
+  <w:style w:type="paragraph" w:default="1" w:styleId="Normal">
     <w:name w:val="Normal"/>
     <w:qFormat/>
   </w:style>
-  <w:style w:type="paragraph" w:styleId="Titolo2">
+  <w:style w:type="paragraph" w:styleId="Heading2">
     <w:name w:val="heading 2"/>
-    <w:basedOn w:val="Normale"/>
-    <w:next w:val="Normale"/>
-    <w:link w:val="Titolo2Carattere"/>
+    <w:basedOn w:val="Normal"/>
+    <w:next w:val="Normal"/>
+    <w:link w:val="Heading2Char"/>
     <w:uiPriority w:val="9"/>
     <w:semiHidden/>
     <w:unhideWhenUsed/>
@@ -2381,10 +2317,10 @@
       <w:szCs w:val="26"/>
     </w:rPr>
   </w:style>
-  <w:style w:type="paragraph" w:styleId="Titolo3">
+  <w:style w:type="paragraph" w:styleId="Heading3">
     <w:name w:val="heading 3"/>
-    <w:basedOn w:val="Normale"/>
-    <w:link w:val="Titolo3Carattere"/>
+    <w:basedOn w:val="Normal"/>
+    <w:link w:val="Heading3Char"/>
     <w:uiPriority w:val="9"/>
     <w:qFormat/>
     <w:rsid w:val="00D44BAA"/>
@@ -2403,11 +2339,11 @@
       <w14:ligatures w14:val="none"/>
     </w:rPr>
   </w:style>
-  <w:style w:type="paragraph" w:styleId="Titolo4">
+  <w:style w:type="paragraph" w:styleId="Heading4">
     <w:name w:val="heading 4"/>
-    <w:basedOn w:val="Normale"/>
-    <w:next w:val="Normale"/>
-    <w:link w:val="Titolo4Carattere"/>
+    <w:basedOn w:val="Normal"/>
+    <w:next w:val="Normal"/>
+    <w:link w:val="Heading4Char"/>
     <w:uiPriority w:val="9"/>
     <w:semiHidden/>
     <w:unhideWhenUsed/>
@@ -2426,13 +2362,13 @@
       <w:color w:val="2F5496" w:themeColor="accent1" w:themeShade="BF"/>
     </w:rPr>
   </w:style>
-  <w:style w:type="character" w:default="1" w:styleId="Carpredefinitoparagrafo">
+  <w:style w:type="character" w:default="1" w:styleId="DefaultParagraphFont">
     <w:name w:val="Default Paragraph Font"/>
     <w:uiPriority w:val="1"/>
     <w:semiHidden/>
     <w:unhideWhenUsed/>
   </w:style>
-  <w:style w:type="table" w:default="1" w:styleId="Tabellanormale">
+  <w:style w:type="table" w:default="1" w:styleId="TableNormal">
     <w:name w:val="Normal Table"/>
     <w:uiPriority w:val="99"/>
     <w:semiHidden/>
@@ -2447,15 +2383,15 @@
       </w:tblCellMar>
     </w:tblPr>
   </w:style>
-  <w:style w:type="numbering" w:default="1" w:styleId="Nessunelenco">
+  <w:style w:type="numbering" w:default="1" w:styleId="NoList">
     <w:name w:val="No List"/>
     <w:uiPriority w:val="99"/>
     <w:semiHidden/>
     <w:unhideWhenUsed/>
   </w:style>
-  <w:style w:type="paragraph" w:styleId="Paragrafoelenco">
+  <w:style w:type="paragraph" w:styleId="ListParagraph">
     <w:name w:val="List Paragraph"/>
-    <w:basedOn w:val="Normale"/>
+    <w:basedOn w:val="Normal"/>
     <w:uiPriority w:val="34"/>
     <w:qFormat/>
     <w:rsid w:val="005A3AEE"/>
@@ -2464,10 +2400,10 @@
       <w:contextualSpacing/>
     </w:pPr>
   </w:style>
-  <w:style w:type="character" w:customStyle="1" w:styleId="Titolo3Carattere">
-    <w:name w:val="Titolo 3 Carattere"/>
-    <w:basedOn w:val="Carpredefinitoparagrafo"/>
-    <w:link w:val="Titolo3"/>
+  <w:style w:type="character" w:customStyle="1" w:styleId="Heading3Char">
+    <w:name w:val="Heading 3 Char"/>
+    <w:basedOn w:val="DefaultParagraphFont"/>
+    <w:link w:val="Heading3"/>
     <w:uiPriority w:val="9"/>
     <w:rsid w:val="00D44BAA"/>
     <w:rPr>
@@ -2481,9 +2417,9 @@
       <w14:ligatures w14:val="none"/>
     </w:rPr>
   </w:style>
-  <w:style w:type="paragraph" w:styleId="NormaleWeb">
+  <w:style w:type="paragraph" w:styleId="NormalWeb">
     <w:name w:val="Normal (Web)"/>
-    <w:basedOn w:val="Normale"/>
+    <w:basedOn w:val="Normal"/>
     <w:uiPriority w:val="99"/>
     <w:semiHidden/>
     <w:unhideWhenUsed/>
@@ -2498,9 +2434,9 @@
       <w14:ligatures w14:val="none"/>
     </w:rPr>
   </w:style>
-  <w:style w:type="character" w:styleId="Enfasigrassetto">
+  <w:style w:type="character" w:styleId="Strong">
     <w:name w:val="Strong"/>
-    <w:basedOn w:val="Carpredefinitoparagrafo"/>
+    <w:basedOn w:val="DefaultParagraphFont"/>
     <w:uiPriority w:val="22"/>
     <w:qFormat/>
     <w:rsid w:val="00A54F5F"/>
@@ -2509,10 +2445,10 @@
       <w:bCs/>
     </w:rPr>
   </w:style>
-  <w:style w:type="character" w:customStyle="1" w:styleId="Titolo4Carattere">
-    <w:name w:val="Titolo 4 Carattere"/>
-    <w:basedOn w:val="Carpredefinitoparagrafo"/>
-    <w:link w:val="Titolo4"/>
+  <w:style w:type="character" w:customStyle="1" w:styleId="Heading4Char">
+    <w:name w:val="Heading 4 Char"/>
+    <w:basedOn w:val="DefaultParagraphFont"/>
+    <w:link w:val="Heading4"/>
     <w:uiPriority w:val="9"/>
     <w:semiHidden/>
     <w:rsid w:val="00A54F5F"/>
@@ -2523,10 +2459,10 @@
       <w:color w:val="2F5496" w:themeColor="accent1" w:themeShade="BF"/>
     </w:rPr>
   </w:style>
-  <w:style w:type="character" w:customStyle="1" w:styleId="Titolo2Carattere">
-    <w:name w:val="Titolo 2 Carattere"/>
-    <w:basedOn w:val="Carpredefinitoparagrafo"/>
-    <w:link w:val="Titolo2"/>
+  <w:style w:type="character" w:customStyle="1" w:styleId="Heading2Char">
+    <w:name w:val="Heading 2 Char"/>
+    <w:basedOn w:val="DefaultParagraphFont"/>
+    <w:link w:val="Heading2"/>
     <w:uiPriority w:val="9"/>
     <w:semiHidden/>
     <w:rsid w:val="00C06C8D"/>

</xml_diff>

<commit_message>
Fix style Brancaleone e Riace. Aggiunto Samo, Caulonia, Cimina, Plati, Riace.
</commit_message>
<xml_diff>
--- a/NOTE SU SITO.docx
+++ b/NOTE SU SITO.docx
@@ -1,6 +1,6 @@
 
 <file path=word/document.xml><?xml version="1.0" encoding="utf-8"?>
-<w:document xmlns:wpc="http://schemas.microsoft.com/office/word/2010/wordprocessingCanvas" xmlns:cx="http://schemas.microsoft.com/office/drawing/2014/chartex" xmlns:cx1="http://schemas.microsoft.com/office/drawing/2015/9/8/chartex" xmlns:cx2="http://schemas.microsoft.com/office/drawing/2015/10/21/chartex" xmlns:cx3="http://schemas.microsoft.com/office/drawing/2016/5/9/chartex" xmlns:cx4="http://schemas.microsoft.com/office/drawing/2016/5/10/chartex" xmlns:cx5="http://schemas.microsoft.com/office/drawing/2016/5/11/chartex" xmlns:cx6="http://schemas.microsoft.com/office/drawing/2016/5/12/chartex" xmlns:cx7="http://schemas.microsoft.com/office/drawing/2016/5/13/chartex" xmlns:cx8="http://schemas.microsoft.com/office/drawing/2016/5/14/chartex" xmlns:mc="http://schemas.openxmlformats.org/markup-compatibility/2006" xmlns:aink="http://schemas.microsoft.com/office/drawing/2016/ink" xmlns:am3d="http://schemas.microsoft.com/office/drawing/2017/model3d" xmlns:o="urn:schemas-microsoft-com:office:office" xmlns:oel="http://schemas.microsoft.com/office/2019/extlst" xmlns:r="http://schemas.openxmlformats.org/officeDocument/2006/relationships" xmlns:m="http://schemas.openxmlformats.org/officeDocument/2006/math" xmlns:v="urn:schemas-microsoft-com:vml" xmlns:wp14="http://schemas.microsoft.com/office/word/2010/wordprocessingDrawing" xmlns:wp="http://schemas.openxmlformats.org/drawingml/2006/wordprocessingDrawing" xmlns:w10="urn:schemas-microsoft-com:office:word" xmlns:w="http://schemas.openxmlformats.org/wordprocessingml/2006/main" xmlns:w14="http://schemas.microsoft.com/office/word/2010/wordml" xmlns:w15="http://schemas.microsoft.com/office/word/2012/wordml" xmlns:w16cex="http://schemas.microsoft.com/office/word/2018/wordml/cex" xmlns:w16cid="http://schemas.microsoft.com/office/word/2016/wordml/cid" xmlns:w16="http://schemas.microsoft.com/office/word/2018/wordml" xmlns:w16du="http://schemas.microsoft.com/office/word/2023/wordml/word16du" xmlns:w16sdtdh="http://schemas.microsoft.com/office/word/2020/wordml/sdtdatahash" xmlns:w16sdtfl="http://schemas.microsoft.com/office/word/2024/wordml/sdtformatlock" xmlns:w16se="http://schemas.microsoft.com/office/word/2015/wordml/symex" xmlns:wpg="http://schemas.microsoft.com/office/word/2010/wordprocessingGroup" xmlns:wpi="http://schemas.microsoft.com/office/word/2010/wordprocessingInk" xmlns:wne="http://schemas.microsoft.com/office/word/2006/wordml" xmlns:wps="http://schemas.microsoft.com/office/word/2010/wordprocessingShape" mc:Ignorable="w14 w15 w16se w16cid w16 w16cex w16sdtdh w16sdtfl w16du wp14">
+<w:document xmlns:wpc="http://schemas.microsoft.com/office/word/2010/wordprocessingCanvas" xmlns:cx="http://schemas.microsoft.com/office/drawing/2014/chartex" xmlns:cx1="http://schemas.microsoft.com/office/drawing/2015/9/8/chartex" xmlns:cx2="http://schemas.microsoft.com/office/drawing/2015/10/21/chartex" xmlns:cx3="http://schemas.microsoft.com/office/drawing/2016/5/9/chartex" xmlns:cx4="http://schemas.microsoft.com/office/drawing/2016/5/10/chartex" xmlns:cx5="http://schemas.microsoft.com/office/drawing/2016/5/11/chartex" xmlns:cx6="http://schemas.microsoft.com/office/drawing/2016/5/12/chartex" xmlns:cx7="http://schemas.microsoft.com/office/drawing/2016/5/13/chartex" xmlns:cx8="http://schemas.microsoft.com/office/drawing/2016/5/14/chartex" xmlns:mc="http://schemas.openxmlformats.org/markup-compatibility/2006" xmlns:aink="http://schemas.microsoft.com/office/drawing/2016/ink" xmlns:am3d="http://schemas.microsoft.com/office/drawing/2017/model3d" xmlns:o="urn:schemas-microsoft-com:office:office" xmlns:oel="http://schemas.microsoft.com/office/2019/extlst" xmlns:r="http://schemas.openxmlformats.org/officeDocument/2006/relationships" xmlns:m="http://schemas.openxmlformats.org/officeDocument/2006/math" xmlns:v="urn:schemas-microsoft-com:vml" xmlns:wp14="http://schemas.microsoft.com/office/word/2010/wordprocessingDrawing" xmlns:wp="http://schemas.openxmlformats.org/drawingml/2006/wordprocessingDrawing" xmlns:w10="urn:schemas-microsoft-com:office:word" xmlns:w="http://schemas.openxmlformats.org/wordprocessingml/2006/main" xmlns:w14="http://schemas.microsoft.com/office/word/2010/wordml" xmlns:w15="http://schemas.microsoft.com/office/word/2012/wordml" xmlns:w16cex="http://schemas.microsoft.com/office/word/2018/wordml/cex" xmlns:w16cid="http://schemas.microsoft.com/office/word/2016/wordml/cid" xmlns:w16="http://schemas.microsoft.com/office/word/2018/wordml" xmlns:w16sdtdh="http://schemas.microsoft.com/office/word/2020/wordml/sdtdatahash" xmlns:w16se="http://schemas.microsoft.com/office/word/2015/wordml/symex" xmlns:wpg="http://schemas.microsoft.com/office/word/2010/wordprocessingGroup" xmlns:wpi="http://schemas.microsoft.com/office/word/2010/wordprocessingInk" xmlns:wne="http://schemas.microsoft.com/office/word/2006/wordml" xmlns:wps="http://schemas.microsoft.com/office/word/2010/wordprocessingShape" mc:Ignorable="w14 w15 w16se w16cid w16 w16cex w16sdtdh wp14">
   <w:body>
     <w:p>
       <w:pPr>
@@ -35,7 +35,7 @@
     </w:p>
     <w:p>
       <w:pPr>
-        <w:pStyle w:val="ListParagraph"/>
+        <w:pStyle w:val="Paragrafoelenco"/>
         <w:numPr>
           <w:ilvl w:val="0"/>
           <w:numId w:val="2"/>
@@ -56,7 +56,7 @@
     </w:p>
     <w:p>
       <w:pPr>
-        <w:pStyle w:val="ListParagraph"/>
+        <w:pStyle w:val="Paragrafoelenco"/>
         <w:numPr>
           <w:ilvl w:val="0"/>
           <w:numId w:val="2"/>
@@ -90,7 +90,7 @@
     </w:p>
     <w:p>
       <w:pPr>
-        <w:pStyle w:val="ListParagraph"/>
+        <w:pStyle w:val="Paragrafoelenco"/>
         <w:numPr>
           <w:ilvl w:val="0"/>
           <w:numId w:val="2"/>
@@ -105,7 +105,7 @@
     </w:p>
     <w:p>
       <w:pPr>
-        <w:pStyle w:val="ListParagraph"/>
+        <w:pStyle w:val="Paragrafoelenco"/>
         <w:numPr>
           <w:ilvl w:val="0"/>
           <w:numId w:val="2"/>
@@ -132,7 +132,7 @@
     </w:p>
     <w:p>
       <w:pPr>
-        <w:pStyle w:val="ListParagraph"/>
+        <w:pStyle w:val="Paragrafoelenco"/>
         <w:numPr>
           <w:ilvl w:val="0"/>
           <w:numId w:val="1"/>
@@ -147,7 +147,7 @@
     </w:p>
     <w:p>
       <w:pPr>
-        <w:pStyle w:val="ListParagraph"/>
+        <w:pStyle w:val="Paragrafoelenco"/>
       </w:pPr>
     </w:p>
     <w:p>
@@ -249,7 +249,7 @@
     </w:p>
     <w:p>
       <w:pPr>
-        <w:pStyle w:val="Heading3"/>
+        <w:pStyle w:val="Titolo3"/>
         <w:shd w:val="clear" w:color="auto" w:fill="FFFFFF"/>
         <w:spacing w:before="0" w:beforeAutospacing="0" w:after="300" w:afterAutospacing="0"/>
         <w:rPr>
@@ -282,7 +282,7 @@
     </w:p>
     <w:p>
       <w:pPr>
-        <w:pStyle w:val="NormalWeb"/>
+        <w:pStyle w:val="NormaleWeb"/>
         <w:shd w:val="clear" w:color="auto" w:fill="FFFFFF"/>
         <w:spacing w:before="0" w:beforeAutospacing="0" w:after="225" w:afterAutospacing="0"/>
         <w:rPr>
@@ -341,7 +341,7 @@
     </w:p>
     <w:p>
       <w:pPr>
-        <w:pStyle w:val="NormalWeb"/>
+        <w:pStyle w:val="NormaleWeb"/>
         <w:shd w:val="clear" w:color="auto" w:fill="FFFFFF"/>
         <w:spacing w:before="0" w:beforeAutospacing="0" w:after="225" w:afterAutospacing="0"/>
         <w:jc w:val="both"/>
@@ -636,7 +636,7 @@
     <w:p/>
     <w:p>
       <w:pPr>
-        <w:pStyle w:val="Heading3"/>
+        <w:pStyle w:val="Titolo3"/>
         <w:shd w:val="clear" w:color="auto" w:fill="FAFBFC"/>
         <w:spacing w:before="0" w:beforeAutospacing="0" w:after="300" w:afterAutospacing="0"/>
         <w:rPr>
@@ -655,7 +655,7 @@
     </w:p>
     <w:p>
       <w:pPr>
-        <w:pStyle w:val="Heading3"/>
+        <w:pStyle w:val="Titolo3"/>
         <w:shd w:val="clear" w:color="auto" w:fill="FAFBFC"/>
         <w:spacing w:before="0" w:beforeAutospacing="0" w:after="300" w:afterAutospacing="0"/>
         <w:rPr>
@@ -674,7 +674,7 @@
     </w:p>
     <w:p>
       <w:pPr>
-        <w:pStyle w:val="Heading3"/>
+        <w:pStyle w:val="Titolo3"/>
         <w:shd w:val="clear" w:color="auto" w:fill="FAFBFC"/>
         <w:spacing w:before="0" w:beforeAutospacing="0" w:after="300" w:afterAutospacing="0"/>
         <w:rPr>
@@ -692,7 +692,7 @@
     </w:p>
     <w:p>
       <w:pPr>
-        <w:pStyle w:val="Heading3"/>
+        <w:pStyle w:val="Titolo3"/>
         <w:shd w:val="clear" w:color="auto" w:fill="FAFBFC"/>
         <w:spacing w:before="0" w:beforeAutospacing="0" w:after="300" w:afterAutospacing="0"/>
         <w:rPr>
@@ -727,7 +727,7 @@
     </w:p>
     <w:p>
       <w:pPr>
-        <w:pStyle w:val="Heading3"/>
+        <w:pStyle w:val="Titolo3"/>
         <w:shd w:val="clear" w:color="auto" w:fill="FAFBFC"/>
         <w:spacing w:before="0" w:beforeAutospacing="0" w:after="300" w:afterAutospacing="0"/>
         <w:rPr>
@@ -745,7 +745,7 @@
     </w:p>
     <w:p>
       <w:pPr>
-        <w:pStyle w:val="NormalWeb"/>
+        <w:pStyle w:val="NormaleWeb"/>
         <w:shd w:val="clear" w:color="auto" w:fill="FAFBFC"/>
         <w:spacing w:before="0" w:beforeAutospacing="0" w:after="0" w:afterAutospacing="0"/>
         <w:rPr>
@@ -757,7 +757,7 @@
       </w:pPr>
       <w:r>
         <w:rPr>
-          <w:rStyle w:val="Strong"/>
+          <w:rStyle w:val="Enfasigrassetto"/>
           <w:rFonts w:ascii="Arial" w:hAnsi="Arial" w:cs="Arial"/>
           <w:color w:val="6B7280"/>
           <w:sz w:val="27"/>
@@ -785,7 +785,7 @@
       </w:r>
       <w:r>
         <w:rPr>
-          <w:rStyle w:val="Strong"/>
+          <w:rStyle w:val="Enfasigrassetto"/>
           <w:rFonts w:ascii="Arial" w:hAnsi="Arial" w:cs="Arial"/>
           <w:color w:val="6B7280"/>
           <w:sz w:val="27"/>
@@ -813,7 +813,7 @@
       </w:r>
       <w:r>
         <w:rPr>
-          <w:rStyle w:val="Strong"/>
+          <w:rStyle w:val="Enfasigrassetto"/>
           <w:rFonts w:ascii="Arial" w:hAnsi="Arial" w:cs="Arial"/>
           <w:color w:val="6B7280"/>
           <w:sz w:val="27"/>
@@ -841,7 +841,7 @@
       </w:r>
       <w:r>
         <w:rPr>
-          <w:rStyle w:val="Strong"/>
+          <w:rStyle w:val="Enfasigrassetto"/>
           <w:rFonts w:ascii="Arial" w:hAnsi="Arial" w:cs="Arial"/>
           <w:color w:val="6B7280"/>
           <w:sz w:val="27"/>
@@ -869,7 +869,7 @@
       </w:r>
       <w:r>
         <w:rPr>
-          <w:rStyle w:val="Strong"/>
+          <w:rStyle w:val="Enfasigrassetto"/>
           <w:rFonts w:ascii="Arial" w:hAnsi="Arial" w:cs="Arial"/>
           <w:color w:val="6B7280"/>
           <w:sz w:val="27"/>
@@ -889,7 +889,7 @@
     </w:p>
     <w:p>
       <w:pPr>
-        <w:pStyle w:val="NormalWeb"/>
+        <w:pStyle w:val="NormaleWeb"/>
         <w:shd w:val="clear" w:color="auto" w:fill="FAFBFC"/>
         <w:spacing w:before="0" w:beforeAutospacing="0" w:after="225" w:afterAutospacing="0"/>
         <w:rPr>
@@ -920,7 +920,7 @@
     </w:p>
     <w:p>
       <w:pPr>
-        <w:pStyle w:val="Heading4"/>
+        <w:pStyle w:val="Titolo4"/>
         <w:spacing w:before="0" w:after="150"/>
         <w:jc w:val="center"/>
         <w:rPr>
@@ -953,7 +953,7 @@
     </w:p>
     <w:p>
       <w:pPr>
-        <w:pStyle w:val="Heading4"/>
+        <w:pStyle w:val="Titolo4"/>
         <w:spacing w:before="0" w:after="150"/>
         <w:jc w:val="center"/>
         <w:rPr>
@@ -971,7 +971,7 @@
     </w:p>
     <w:p>
       <w:pPr>
-        <w:pStyle w:val="NormalWeb"/>
+        <w:pStyle w:val="NormaleWeb"/>
         <w:spacing w:before="0" w:beforeAutospacing="0" w:after="0" w:afterAutospacing="0"/>
         <w:jc w:val="center"/>
         <w:rPr>
@@ -981,7 +981,7 @@
       </w:pPr>
       <w:r>
         <w:rPr>
-          <w:rStyle w:val="Strong"/>
+          <w:rStyle w:val="Enfasigrassetto"/>
           <w:rFonts w:ascii="Arial" w:hAnsi="Arial" w:cs="Arial"/>
           <w:color w:val="FF0000"/>
         </w:rPr>
@@ -1020,7 +1020,7 @@
       </w:r>
       <w:r>
         <w:rPr>
-          <w:rStyle w:val="Strong"/>
+          <w:rStyle w:val="Enfasigrassetto"/>
           <w:rFonts w:ascii="Arial" w:hAnsi="Arial" w:cs="Arial"/>
           <w:color w:val="FF0000"/>
         </w:rPr>
@@ -1042,7 +1042,7 @@
       </w:r>
       <w:r>
         <w:rPr>
-          <w:rStyle w:val="Strong"/>
+          <w:rStyle w:val="Enfasigrassetto"/>
           <w:rFonts w:ascii="Arial" w:hAnsi="Arial" w:cs="Arial"/>
           <w:color w:val="FF0000"/>
         </w:rPr>
@@ -1066,7 +1066,7 @@
     </w:p>
     <w:p>
       <w:pPr>
-        <w:pStyle w:val="Heading3"/>
+        <w:pStyle w:val="Titolo3"/>
         <w:shd w:val="clear" w:color="auto" w:fill="FAFBFC"/>
         <w:spacing w:before="0" w:beforeAutospacing="0" w:after="300" w:afterAutospacing="0"/>
         <w:rPr>
@@ -1102,7 +1102,7 @@
     </w:p>
     <w:p>
       <w:pPr>
-        <w:pStyle w:val="Heading3"/>
+        <w:pStyle w:val="Titolo3"/>
         <w:shd w:val="clear" w:color="auto" w:fill="FFFFFF"/>
         <w:spacing w:before="0" w:beforeAutospacing="0" w:after="300" w:afterAutospacing="0"/>
         <w:rPr>
@@ -1120,7 +1120,7 @@
     </w:p>
     <w:p>
       <w:pPr>
-        <w:pStyle w:val="Heading3"/>
+        <w:pStyle w:val="Titolo3"/>
         <w:shd w:val="clear" w:color="auto" w:fill="FFFFFF"/>
         <w:spacing w:before="0" w:beforeAutospacing="0" w:after="300" w:afterAutospacing="0"/>
         <w:rPr>
@@ -1210,7 +1210,7 @@
     </w:p>
     <w:p>
       <w:pPr>
-        <w:pStyle w:val="Heading2"/>
+        <w:pStyle w:val="Titolo2"/>
         <w:shd w:val="clear" w:color="auto" w:fill="FAFBFC"/>
         <w:spacing w:before="0" w:after="360"/>
         <w:jc w:val="center"/>
@@ -1265,7 +1265,7 @@
     </w:p>
     <w:p>
       <w:pPr>
-        <w:pStyle w:val="NormalWeb"/>
+        <w:pStyle w:val="NormaleWeb"/>
         <w:shd w:val="clear" w:color="auto" w:fill="FAFBFC"/>
         <w:spacing w:before="0" w:beforeAutospacing="0" w:after="600" w:afterAutospacing="0"/>
         <w:jc w:val="center"/>
@@ -1427,7 +1427,7 @@
     </w:p>
     <w:p>
       <w:pPr>
-        <w:pStyle w:val="ListParagraph"/>
+        <w:pStyle w:val="Paragrafoelenco"/>
         <w:rPr>
           <w:b/>
           <w:bCs/>
@@ -1443,7 +1443,7 @@
     </w:p>
     <w:p>
       <w:pPr>
-        <w:pStyle w:val="ListParagraph"/>
+        <w:pStyle w:val="Paragrafoelenco"/>
         <w:rPr>
           <w:b/>
           <w:bCs/>
@@ -1459,16 +1459,16 @@
     </w:p>
     <w:p>
       <w:pPr>
-        <w:pStyle w:val="ListParagraph"/>
-        <w:rPr>
-          <w:b/>
-          <w:bCs/>
-        </w:rPr>
-      </w:pPr>
-    </w:p>
-    <w:p>
-      <w:pPr>
-        <w:pStyle w:val="ListParagraph"/>
+        <w:pStyle w:val="Paragrafoelenco"/>
+        <w:rPr>
+          <w:b/>
+          <w:bCs/>
+        </w:rPr>
+      </w:pPr>
+    </w:p>
+    <w:p>
+      <w:pPr>
+        <w:pStyle w:val="Paragrafoelenco"/>
       </w:pPr>
       <w:r>
         <w:t>RIMANGONO:</w:t>
@@ -1476,12 +1476,12 @@
     </w:p>
     <w:p>
       <w:pPr>
-        <w:pStyle w:val="ListParagraph"/>
-      </w:pPr>
-    </w:p>
-    <w:p>
-      <w:pPr>
-        <w:pStyle w:val="ListParagraph"/>
+        <w:pStyle w:val="Paragrafoelenco"/>
+      </w:pPr>
+    </w:p>
+    <w:p>
+      <w:pPr>
+        <w:pStyle w:val="Paragrafoelenco"/>
       </w:pPr>
       <w:r>
         <w:t>CAULONIA</w:t>
@@ -1489,7 +1489,7 @@
     </w:p>
     <w:p>
       <w:pPr>
-        <w:pStyle w:val="ListParagraph"/>
+        <w:pStyle w:val="Paragrafoelenco"/>
       </w:pPr>
       <w:r>
         <w:t>CIMINA’</w:t>
@@ -1497,7 +1497,7 @@
     </w:p>
     <w:p>
       <w:pPr>
-        <w:pStyle w:val="ListParagraph"/>
+        <w:pStyle w:val="Paragrafoelenco"/>
       </w:pPr>
       <w:r>
         <w:t>PLATI’</w:t>
@@ -1505,7 +1505,7 @@
     </w:p>
     <w:p>
       <w:pPr>
-        <w:pStyle w:val="ListParagraph"/>
+        <w:pStyle w:val="Paragrafoelenco"/>
       </w:pPr>
       <w:r>
         <w:t>RIACE</w:t>
@@ -1513,7 +1513,7 @@
     </w:p>
     <w:p>
       <w:pPr>
-        <w:pStyle w:val="ListParagraph"/>
+        <w:pStyle w:val="Paragrafoelenco"/>
       </w:pPr>
       <w:r>
         <w:t>ROCCELLA IONICA</w:t>
@@ -1521,7 +1521,7 @@
     </w:p>
     <w:p>
       <w:pPr>
-        <w:pStyle w:val="ListParagraph"/>
+        <w:pStyle w:val="Paragrafoelenco"/>
       </w:pPr>
       <w:r>
         <w:t>SIDERNO</w:t>
@@ -1537,6 +1537,21 @@
       <w:r>
         <w:t>STILO</w:t>
       </w:r>
+    </w:p>
+    <w:p>
+      <w:pPr>
+        <w:ind w:left="360"/>
+      </w:pPr>
+    </w:p>
+    <w:p>
+      <w:pPr>
+        <w:ind w:left="360"/>
+      </w:pPr>
+      <w:proofErr w:type="spellStart"/>
+      <w:r>
+        <w:t>casignana</w:t>
+      </w:r>
+      <w:proofErr w:type="spellEnd"/>
     </w:p>
     <w:p>
       <w:pPr>
@@ -1689,7 +1704,7 @@
 </file>
 
 <file path=word/numbering.xml><?xml version="1.0" encoding="utf-8"?>
-<w:numbering xmlns:wpc="http://schemas.microsoft.com/office/word/2010/wordprocessingCanvas" xmlns:cx="http://schemas.microsoft.com/office/drawing/2014/chartex" xmlns:cx1="http://schemas.microsoft.com/office/drawing/2015/9/8/chartex" xmlns:cx2="http://schemas.microsoft.com/office/drawing/2015/10/21/chartex" xmlns:cx3="http://schemas.microsoft.com/office/drawing/2016/5/9/chartex" xmlns:cx4="http://schemas.microsoft.com/office/drawing/2016/5/10/chartex" xmlns:cx5="http://schemas.microsoft.com/office/drawing/2016/5/11/chartex" xmlns:cx6="http://schemas.microsoft.com/office/drawing/2016/5/12/chartex" xmlns:cx7="http://schemas.microsoft.com/office/drawing/2016/5/13/chartex" xmlns:cx8="http://schemas.microsoft.com/office/drawing/2016/5/14/chartex" xmlns:mc="http://schemas.openxmlformats.org/markup-compatibility/2006" xmlns:aink="http://schemas.microsoft.com/office/drawing/2016/ink" xmlns:am3d="http://schemas.microsoft.com/office/drawing/2017/model3d" xmlns:o="urn:schemas-microsoft-com:office:office" xmlns:oel="http://schemas.microsoft.com/office/2019/extlst" xmlns:r="http://schemas.openxmlformats.org/officeDocument/2006/relationships" xmlns:m="http://schemas.openxmlformats.org/officeDocument/2006/math" xmlns:v="urn:schemas-microsoft-com:vml" xmlns:wp14="http://schemas.microsoft.com/office/word/2010/wordprocessingDrawing" xmlns:wp="http://schemas.openxmlformats.org/drawingml/2006/wordprocessingDrawing" xmlns:w10="urn:schemas-microsoft-com:office:word" xmlns:w="http://schemas.openxmlformats.org/wordprocessingml/2006/main" xmlns:w14="http://schemas.microsoft.com/office/word/2010/wordml" xmlns:w15="http://schemas.microsoft.com/office/word/2012/wordml" xmlns:w16cex="http://schemas.microsoft.com/office/word/2018/wordml/cex" xmlns:w16cid="http://schemas.microsoft.com/office/word/2016/wordml/cid" xmlns:w16="http://schemas.microsoft.com/office/word/2018/wordml" xmlns:w16du="http://schemas.microsoft.com/office/word/2023/wordml/word16du" xmlns:w16sdtdh="http://schemas.microsoft.com/office/word/2020/wordml/sdtdatahash" xmlns:w16sdtfl="http://schemas.microsoft.com/office/word/2024/wordml/sdtformatlock" xmlns:w16se="http://schemas.microsoft.com/office/word/2015/wordml/symex" xmlns:wpg="http://schemas.microsoft.com/office/word/2010/wordprocessingGroup" xmlns:wpi="http://schemas.microsoft.com/office/word/2010/wordprocessingInk" xmlns:wne="http://schemas.microsoft.com/office/word/2006/wordml" xmlns:wps="http://schemas.microsoft.com/office/word/2010/wordprocessingShape" mc:Ignorable="w14 w15 w16se w16cid w16 w16cex w16sdtdh w16sdtfl w16du wp14">
+<w:numbering xmlns:wpc="http://schemas.microsoft.com/office/word/2010/wordprocessingCanvas" xmlns:cx="http://schemas.microsoft.com/office/drawing/2014/chartex" xmlns:cx1="http://schemas.microsoft.com/office/drawing/2015/9/8/chartex" xmlns:cx2="http://schemas.microsoft.com/office/drawing/2015/10/21/chartex" xmlns:cx3="http://schemas.microsoft.com/office/drawing/2016/5/9/chartex" xmlns:cx4="http://schemas.microsoft.com/office/drawing/2016/5/10/chartex" xmlns:cx5="http://schemas.microsoft.com/office/drawing/2016/5/11/chartex" xmlns:cx6="http://schemas.microsoft.com/office/drawing/2016/5/12/chartex" xmlns:cx7="http://schemas.microsoft.com/office/drawing/2016/5/13/chartex" xmlns:cx8="http://schemas.microsoft.com/office/drawing/2016/5/14/chartex" xmlns:mc="http://schemas.openxmlformats.org/markup-compatibility/2006" xmlns:aink="http://schemas.microsoft.com/office/drawing/2016/ink" xmlns:am3d="http://schemas.microsoft.com/office/drawing/2017/model3d" xmlns:o="urn:schemas-microsoft-com:office:office" xmlns:oel="http://schemas.microsoft.com/office/2019/extlst" xmlns:r="http://schemas.openxmlformats.org/officeDocument/2006/relationships" xmlns:m="http://schemas.openxmlformats.org/officeDocument/2006/math" xmlns:v="urn:schemas-microsoft-com:vml" xmlns:wp14="http://schemas.microsoft.com/office/word/2010/wordprocessingDrawing" xmlns:wp="http://schemas.openxmlformats.org/drawingml/2006/wordprocessingDrawing" xmlns:w10="urn:schemas-microsoft-com:office:word" xmlns:w="http://schemas.openxmlformats.org/wordprocessingml/2006/main" xmlns:w14="http://schemas.microsoft.com/office/word/2010/wordml" xmlns:w15="http://schemas.microsoft.com/office/word/2012/wordml" xmlns:w16cex="http://schemas.microsoft.com/office/word/2018/wordml/cex" xmlns:w16cid="http://schemas.microsoft.com/office/word/2016/wordml/cid" xmlns:w16="http://schemas.microsoft.com/office/word/2018/wordml" xmlns:w16sdtdh="http://schemas.microsoft.com/office/word/2020/wordml/sdtdatahash" xmlns:w16se="http://schemas.microsoft.com/office/word/2015/wordml/symex" xmlns:wpg="http://schemas.microsoft.com/office/word/2010/wordprocessingGroup" xmlns:wpi="http://schemas.microsoft.com/office/word/2010/wordprocessingInk" xmlns:wne="http://schemas.microsoft.com/office/word/2006/wordml" xmlns:wps="http://schemas.microsoft.com/office/word/2010/wordprocessingShape" mc:Ignorable="w14 w15 w16se w16cid w16 w16cex w16sdtdh wp14">
   <w:abstractNum w:abstractNumId="0" w15:restartNumberingAfterBreak="0">
     <w:nsid w:val="1B500148"/>
     <w:multiLevelType w:val="hybridMultilevel"/>
@@ -1898,7 +1913,7 @@
 </file>
 
 <file path=word/styles.xml><?xml version="1.0" encoding="utf-8"?>
-<w:styles xmlns:mc="http://schemas.openxmlformats.org/markup-compatibility/2006" xmlns:r="http://schemas.openxmlformats.org/officeDocument/2006/relationships" xmlns:w="http://schemas.openxmlformats.org/wordprocessingml/2006/main" xmlns:w14="http://schemas.microsoft.com/office/word/2010/wordml" xmlns:w15="http://schemas.microsoft.com/office/word/2012/wordml" xmlns:w16cex="http://schemas.microsoft.com/office/word/2018/wordml/cex" xmlns:w16cid="http://schemas.microsoft.com/office/word/2016/wordml/cid" xmlns:w16="http://schemas.microsoft.com/office/word/2018/wordml" xmlns:w16du="http://schemas.microsoft.com/office/word/2023/wordml/word16du" xmlns:w16sdtdh="http://schemas.microsoft.com/office/word/2020/wordml/sdtdatahash" xmlns:w16sdtfl="http://schemas.microsoft.com/office/word/2024/wordml/sdtformatlock" xmlns:w16se="http://schemas.microsoft.com/office/word/2015/wordml/symex" mc:Ignorable="w14 w15 w16se w16cid w16 w16cex w16sdtdh w16sdtfl w16du">
+<w:styles xmlns:mc="http://schemas.openxmlformats.org/markup-compatibility/2006" xmlns:r="http://schemas.openxmlformats.org/officeDocument/2006/relationships" xmlns:w="http://schemas.openxmlformats.org/wordprocessingml/2006/main" xmlns:w14="http://schemas.microsoft.com/office/word/2010/wordml" xmlns:w15="http://schemas.microsoft.com/office/word/2012/wordml" xmlns:w16cex="http://schemas.microsoft.com/office/word/2018/wordml/cex" xmlns:w16cid="http://schemas.microsoft.com/office/word/2016/wordml/cid" xmlns:w16="http://schemas.microsoft.com/office/word/2018/wordml" xmlns:w16sdtdh="http://schemas.microsoft.com/office/word/2020/wordml/sdtdatahash" xmlns:w16se="http://schemas.microsoft.com/office/word/2015/wordml/symex" mc:Ignorable="w14 w15 w16se w16cid w16 w16cex w16sdtdh">
   <w:docDefaults>
     <w:rPrDefault>
       <w:rPr>
@@ -2290,15 +2305,15 @@
     <w:lsdException w:name="Unresolved Mention" w:semiHidden="1" w:unhideWhenUsed="1"/>
     <w:lsdException w:name="Smart Link" w:semiHidden="1" w:unhideWhenUsed="1"/>
   </w:latentStyles>
-  <w:style w:type="paragraph" w:default="1" w:styleId="Normal">
+  <w:style w:type="paragraph" w:default="1" w:styleId="Normale">
     <w:name w:val="Normal"/>
     <w:qFormat/>
   </w:style>
-  <w:style w:type="paragraph" w:styleId="Heading2">
+  <w:style w:type="paragraph" w:styleId="Titolo2">
     <w:name w:val="heading 2"/>
-    <w:basedOn w:val="Normal"/>
-    <w:next w:val="Normal"/>
-    <w:link w:val="Heading2Char"/>
+    <w:basedOn w:val="Normale"/>
+    <w:next w:val="Normale"/>
+    <w:link w:val="Titolo2Carattere"/>
     <w:uiPriority w:val="9"/>
     <w:semiHidden/>
     <w:unhideWhenUsed/>
@@ -2317,10 +2332,10 @@
       <w:szCs w:val="26"/>
     </w:rPr>
   </w:style>
-  <w:style w:type="paragraph" w:styleId="Heading3">
+  <w:style w:type="paragraph" w:styleId="Titolo3">
     <w:name w:val="heading 3"/>
-    <w:basedOn w:val="Normal"/>
-    <w:link w:val="Heading3Char"/>
+    <w:basedOn w:val="Normale"/>
+    <w:link w:val="Titolo3Carattere"/>
     <w:uiPriority w:val="9"/>
     <w:qFormat/>
     <w:rsid w:val="00D44BAA"/>
@@ -2339,11 +2354,11 @@
       <w14:ligatures w14:val="none"/>
     </w:rPr>
   </w:style>
-  <w:style w:type="paragraph" w:styleId="Heading4">
+  <w:style w:type="paragraph" w:styleId="Titolo4">
     <w:name w:val="heading 4"/>
-    <w:basedOn w:val="Normal"/>
-    <w:next w:val="Normal"/>
-    <w:link w:val="Heading4Char"/>
+    <w:basedOn w:val="Normale"/>
+    <w:next w:val="Normale"/>
+    <w:link w:val="Titolo4Carattere"/>
     <w:uiPriority w:val="9"/>
     <w:semiHidden/>
     <w:unhideWhenUsed/>
@@ -2362,13 +2377,13 @@
       <w:color w:val="2F5496" w:themeColor="accent1" w:themeShade="BF"/>
     </w:rPr>
   </w:style>
-  <w:style w:type="character" w:default="1" w:styleId="DefaultParagraphFont">
+  <w:style w:type="character" w:default="1" w:styleId="Carpredefinitoparagrafo">
     <w:name w:val="Default Paragraph Font"/>
     <w:uiPriority w:val="1"/>
     <w:semiHidden/>
     <w:unhideWhenUsed/>
   </w:style>
-  <w:style w:type="table" w:default="1" w:styleId="TableNormal">
+  <w:style w:type="table" w:default="1" w:styleId="Tabellanormale">
     <w:name w:val="Normal Table"/>
     <w:uiPriority w:val="99"/>
     <w:semiHidden/>
@@ -2383,15 +2398,15 @@
       </w:tblCellMar>
     </w:tblPr>
   </w:style>
-  <w:style w:type="numbering" w:default="1" w:styleId="NoList">
+  <w:style w:type="numbering" w:default="1" w:styleId="Nessunelenco">
     <w:name w:val="No List"/>
     <w:uiPriority w:val="99"/>
     <w:semiHidden/>
     <w:unhideWhenUsed/>
   </w:style>
-  <w:style w:type="paragraph" w:styleId="ListParagraph">
+  <w:style w:type="paragraph" w:styleId="Paragrafoelenco">
     <w:name w:val="List Paragraph"/>
-    <w:basedOn w:val="Normal"/>
+    <w:basedOn w:val="Normale"/>
     <w:uiPriority w:val="34"/>
     <w:qFormat/>
     <w:rsid w:val="005A3AEE"/>
@@ -2400,10 +2415,10 @@
       <w:contextualSpacing/>
     </w:pPr>
   </w:style>
-  <w:style w:type="character" w:customStyle="1" w:styleId="Heading3Char">
-    <w:name w:val="Heading 3 Char"/>
-    <w:basedOn w:val="DefaultParagraphFont"/>
-    <w:link w:val="Heading3"/>
+  <w:style w:type="character" w:customStyle="1" w:styleId="Titolo3Carattere">
+    <w:name w:val="Titolo 3 Carattere"/>
+    <w:basedOn w:val="Carpredefinitoparagrafo"/>
+    <w:link w:val="Titolo3"/>
     <w:uiPriority w:val="9"/>
     <w:rsid w:val="00D44BAA"/>
     <w:rPr>
@@ -2417,9 +2432,9 @@
       <w14:ligatures w14:val="none"/>
     </w:rPr>
   </w:style>
-  <w:style w:type="paragraph" w:styleId="NormalWeb">
+  <w:style w:type="paragraph" w:styleId="NormaleWeb">
     <w:name w:val="Normal (Web)"/>
-    <w:basedOn w:val="Normal"/>
+    <w:basedOn w:val="Normale"/>
     <w:uiPriority w:val="99"/>
     <w:semiHidden/>
     <w:unhideWhenUsed/>
@@ -2434,9 +2449,9 @@
       <w14:ligatures w14:val="none"/>
     </w:rPr>
   </w:style>
-  <w:style w:type="character" w:styleId="Strong">
+  <w:style w:type="character" w:styleId="Enfasigrassetto">
     <w:name w:val="Strong"/>
-    <w:basedOn w:val="DefaultParagraphFont"/>
+    <w:basedOn w:val="Carpredefinitoparagrafo"/>
     <w:uiPriority w:val="22"/>
     <w:qFormat/>
     <w:rsid w:val="00A54F5F"/>
@@ -2445,10 +2460,10 @@
       <w:bCs/>
     </w:rPr>
   </w:style>
-  <w:style w:type="character" w:customStyle="1" w:styleId="Heading4Char">
-    <w:name w:val="Heading 4 Char"/>
-    <w:basedOn w:val="DefaultParagraphFont"/>
-    <w:link w:val="Heading4"/>
+  <w:style w:type="character" w:customStyle="1" w:styleId="Titolo4Carattere">
+    <w:name w:val="Titolo 4 Carattere"/>
+    <w:basedOn w:val="Carpredefinitoparagrafo"/>
+    <w:link w:val="Titolo4"/>
     <w:uiPriority w:val="9"/>
     <w:semiHidden/>
     <w:rsid w:val="00A54F5F"/>
@@ -2459,10 +2474,10 @@
       <w:color w:val="2F5496" w:themeColor="accent1" w:themeShade="BF"/>
     </w:rPr>
   </w:style>
-  <w:style w:type="character" w:customStyle="1" w:styleId="Heading2Char">
-    <w:name w:val="Heading 2 Char"/>
-    <w:basedOn w:val="DefaultParagraphFont"/>
-    <w:link w:val="Heading2"/>
+  <w:style w:type="character" w:customStyle="1" w:styleId="Titolo2Carattere">
+    <w:name w:val="Titolo 2 Carattere"/>
+    <w:basedOn w:val="Carpredefinitoparagrafo"/>
+    <w:link w:val="Titolo2"/>
     <w:uiPriority w:val="9"/>
     <w:semiHidden/>
     <w:rsid w:val="00C06C8D"/>

</xml_diff>

<commit_message>
Aggiunto sant'Agata + vari aggiustamenti al template ecc..
</commit_message>
<xml_diff>
--- a/NOTE SU SITO.docx
+++ b/NOTE SU SITO.docx
@@ -1,6 +1,6 @@
 
 <file path=word/document.xml><?xml version="1.0" encoding="utf-8"?>
-<w:document xmlns:wpc="http://schemas.microsoft.com/office/word/2010/wordprocessingCanvas" xmlns:cx="http://schemas.microsoft.com/office/drawing/2014/chartex" xmlns:cx1="http://schemas.microsoft.com/office/drawing/2015/9/8/chartex" xmlns:cx2="http://schemas.microsoft.com/office/drawing/2015/10/21/chartex" xmlns:cx3="http://schemas.microsoft.com/office/drawing/2016/5/9/chartex" xmlns:cx4="http://schemas.microsoft.com/office/drawing/2016/5/10/chartex" xmlns:cx5="http://schemas.microsoft.com/office/drawing/2016/5/11/chartex" xmlns:cx6="http://schemas.microsoft.com/office/drawing/2016/5/12/chartex" xmlns:cx7="http://schemas.microsoft.com/office/drawing/2016/5/13/chartex" xmlns:cx8="http://schemas.microsoft.com/office/drawing/2016/5/14/chartex" xmlns:mc="http://schemas.openxmlformats.org/markup-compatibility/2006" xmlns:aink="http://schemas.microsoft.com/office/drawing/2016/ink" xmlns:am3d="http://schemas.microsoft.com/office/drawing/2017/model3d" xmlns:o="urn:schemas-microsoft-com:office:office" xmlns:oel="http://schemas.microsoft.com/office/2019/extlst" xmlns:r="http://schemas.openxmlformats.org/officeDocument/2006/relationships" xmlns:m="http://schemas.openxmlformats.org/officeDocument/2006/math" xmlns:v="urn:schemas-microsoft-com:vml" xmlns:wp14="http://schemas.microsoft.com/office/word/2010/wordprocessingDrawing" xmlns:wp="http://schemas.openxmlformats.org/drawingml/2006/wordprocessingDrawing" xmlns:w10="urn:schemas-microsoft-com:office:word" xmlns:w="http://schemas.openxmlformats.org/wordprocessingml/2006/main" xmlns:w14="http://schemas.microsoft.com/office/word/2010/wordml" xmlns:w15="http://schemas.microsoft.com/office/word/2012/wordml" xmlns:w16cex="http://schemas.microsoft.com/office/word/2018/wordml/cex" xmlns:w16cid="http://schemas.microsoft.com/office/word/2016/wordml/cid" xmlns:w16="http://schemas.microsoft.com/office/word/2018/wordml" xmlns:w16sdtdh="http://schemas.microsoft.com/office/word/2020/wordml/sdtdatahash" xmlns:w16se="http://schemas.microsoft.com/office/word/2015/wordml/symex" xmlns:wpg="http://schemas.microsoft.com/office/word/2010/wordprocessingGroup" xmlns:wpi="http://schemas.microsoft.com/office/word/2010/wordprocessingInk" xmlns:wne="http://schemas.microsoft.com/office/word/2006/wordml" xmlns:wps="http://schemas.microsoft.com/office/word/2010/wordprocessingShape" mc:Ignorable="w14 w15 w16se w16cid w16 w16cex w16sdtdh wp14">
+<w:document xmlns:wpc="http://schemas.microsoft.com/office/word/2010/wordprocessingCanvas" xmlns:cx="http://schemas.microsoft.com/office/drawing/2014/chartex" xmlns:cx1="http://schemas.microsoft.com/office/drawing/2015/9/8/chartex" xmlns:cx2="http://schemas.microsoft.com/office/drawing/2015/10/21/chartex" xmlns:cx3="http://schemas.microsoft.com/office/drawing/2016/5/9/chartex" xmlns:cx4="http://schemas.microsoft.com/office/drawing/2016/5/10/chartex" xmlns:cx5="http://schemas.microsoft.com/office/drawing/2016/5/11/chartex" xmlns:cx6="http://schemas.microsoft.com/office/drawing/2016/5/12/chartex" xmlns:cx7="http://schemas.microsoft.com/office/drawing/2016/5/13/chartex" xmlns:cx8="http://schemas.microsoft.com/office/drawing/2016/5/14/chartex" xmlns:mc="http://schemas.openxmlformats.org/markup-compatibility/2006" xmlns:aink="http://schemas.microsoft.com/office/drawing/2016/ink" xmlns:am3d="http://schemas.microsoft.com/office/drawing/2017/model3d" xmlns:o="urn:schemas-microsoft-com:office:office" xmlns:oel="http://schemas.microsoft.com/office/2019/extlst" xmlns:r="http://schemas.openxmlformats.org/officeDocument/2006/relationships" xmlns:m="http://schemas.openxmlformats.org/officeDocument/2006/math" xmlns:v="urn:schemas-microsoft-com:vml" xmlns:wp14="http://schemas.microsoft.com/office/word/2010/wordprocessingDrawing" xmlns:wp="http://schemas.openxmlformats.org/drawingml/2006/wordprocessingDrawing" xmlns:w10="urn:schemas-microsoft-com:office:word" xmlns:w="http://schemas.openxmlformats.org/wordprocessingml/2006/main" xmlns:w14="http://schemas.microsoft.com/office/word/2010/wordml" xmlns:w15="http://schemas.microsoft.com/office/word/2012/wordml" xmlns:w16cex="http://schemas.microsoft.com/office/word/2018/wordml/cex" xmlns:w16cid="http://schemas.microsoft.com/office/word/2016/wordml/cid" xmlns:w16="http://schemas.microsoft.com/office/word/2018/wordml" xmlns:w16du="http://schemas.microsoft.com/office/word/2023/wordml/word16du" xmlns:w16sdtdh="http://schemas.microsoft.com/office/word/2020/wordml/sdtdatahash" xmlns:w16sdtfl="http://schemas.microsoft.com/office/word/2024/wordml/sdtformatlock" xmlns:w16se="http://schemas.microsoft.com/office/word/2015/wordml/symex" xmlns:wpg="http://schemas.microsoft.com/office/word/2010/wordprocessingGroup" xmlns:wpi="http://schemas.microsoft.com/office/word/2010/wordprocessingInk" xmlns:wne="http://schemas.microsoft.com/office/word/2006/wordml" xmlns:wps="http://schemas.microsoft.com/office/word/2010/wordprocessingShape" mc:Ignorable="w14 w15 w16se w16cid w16 w16cex w16sdtdh w16sdtfl w16du wp14">
   <w:body>
     <w:p>
       <w:pPr>
@@ -35,7 +35,7 @@
     </w:p>
     <w:p>
       <w:pPr>
-        <w:pStyle w:val="Paragrafoelenco"/>
+        <w:pStyle w:val="ListParagraph"/>
         <w:numPr>
           <w:ilvl w:val="0"/>
           <w:numId w:val="2"/>
@@ -56,7 +56,7 @@
     </w:p>
     <w:p>
       <w:pPr>
-        <w:pStyle w:val="Paragrafoelenco"/>
+        <w:pStyle w:val="ListParagraph"/>
         <w:numPr>
           <w:ilvl w:val="0"/>
           <w:numId w:val="2"/>
@@ -90,7 +90,7 @@
     </w:p>
     <w:p>
       <w:pPr>
-        <w:pStyle w:val="Paragrafoelenco"/>
+        <w:pStyle w:val="ListParagraph"/>
         <w:numPr>
           <w:ilvl w:val="0"/>
           <w:numId w:val="2"/>
@@ -105,7 +105,7 @@
     </w:p>
     <w:p>
       <w:pPr>
-        <w:pStyle w:val="Paragrafoelenco"/>
+        <w:pStyle w:val="ListParagraph"/>
         <w:numPr>
           <w:ilvl w:val="0"/>
           <w:numId w:val="2"/>
@@ -132,7 +132,7 @@
     </w:p>
     <w:p>
       <w:pPr>
-        <w:pStyle w:val="Paragrafoelenco"/>
+        <w:pStyle w:val="ListParagraph"/>
         <w:numPr>
           <w:ilvl w:val="0"/>
           <w:numId w:val="1"/>
@@ -147,7 +147,7 @@
     </w:p>
     <w:p>
       <w:pPr>
-        <w:pStyle w:val="Paragrafoelenco"/>
+        <w:pStyle w:val="ListParagraph"/>
       </w:pPr>
     </w:p>
     <w:p>
@@ -249,7 +249,7 @@
     </w:p>
     <w:p>
       <w:pPr>
-        <w:pStyle w:val="Titolo3"/>
+        <w:pStyle w:val="Heading3"/>
         <w:shd w:val="clear" w:color="auto" w:fill="FFFFFF"/>
         <w:spacing w:before="0" w:beforeAutospacing="0" w:after="300" w:afterAutospacing="0"/>
         <w:rPr>
@@ -282,7 +282,7 @@
     </w:p>
     <w:p>
       <w:pPr>
-        <w:pStyle w:val="NormaleWeb"/>
+        <w:pStyle w:val="NormalWeb"/>
         <w:shd w:val="clear" w:color="auto" w:fill="FFFFFF"/>
         <w:spacing w:before="0" w:beforeAutospacing="0" w:after="225" w:afterAutospacing="0"/>
         <w:rPr>
@@ -341,7 +341,7 @@
     </w:p>
     <w:p>
       <w:pPr>
-        <w:pStyle w:val="NormaleWeb"/>
+        <w:pStyle w:val="NormalWeb"/>
         <w:shd w:val="clear" w:color="auto" w:fill="FFFFFF"/>
         <w:spacing w:before="0" w:beforeAutospacing="0" w:after="225" w:afterAutospacing="0"/>
         <w:jc w:val="both"/>
@@ -636,7 +636,7 @@
     <w:p/>
     <w:p>
       <w:pPr>
-        <w:pStyle w:val="Titolo3"/>
+        <w:pStyle w:val="Heading3"/>
         <w:shd w:val="clear" w:color="auto" w:fill="FAFBFC"/>
         <w:spacing w:before="0" w:beforeAutospacing="0" w:after="300" w:afterAutospacing="0"/>
         <w:rPr>
@@ -655,7 +655,7 @@
     </w:p>
     <w:p>
       <w:pPr>
-        <w:pStyle w:val="Titolo3"/>
+        <w:pStyle w:val="Heading3"/>
         <w:shd w:val="clear" w:color="auto" w:fill="FAFBFC"/>
         <w:spacing w:before="0" w:beforeAutospacing="0" w:after="300" w:afterAutospacing="0"/>
         <w:rPr>
@@ -674,7 +674,7 @@
     </w:p>
     <w:p>
       <w:pPr>
-        <w:pStyle w:val="Titolo3"/>
+        <w:pStyle w:val="Heading3"/>
         <w:shd w:val="clear" w:color="auto" w:fill="FAFBFC"/>
         <w:spacing w:before="0" w:beforeAutospacing="0" w:after="300" w:afterAutospacing="0"/>
         <w:rPr>
@@ -692,7 +692,7 @@
     </w:p>
     <w:p>
       <w:pPr>
-        <w:pStyle w:val="Titolo3"/>
+        <w:pStyle w:val="Heading3"/>
         <w:shd w:val="clear" w:color="auto" w:fill="FAFBFC"/>
         <w:spacing w:before="0" w:beforeAutospacing="0" w:after="300" w:afterAutospacing="0"/>
         <w:rPr>
@@ -727,7 +727,7 @@
     </w:p>
     <w:p>
       <w:pPr>
-        <w:pStyle w:val="Titolo3"/>
+        <w:pStyle w:val="Heading3"/>
         <w:shd w:val="clear" w:color="auto" w:fill="FAFBFC"/>
         <w:spacing w:before="0" w:beforeAutospacing="0" w:after="300" w:afterAutospacing="0"/>
         <w:rPr>
@@ -745,7 +745,7 @@
     </w:p>
     <w:p>
       <w:pPr>
-        <w:pStyle w:val="NormaleWeb"/>
+        <w:pStyle w:val="NormalWeb"/>
         <w:shd w:val="clear" w:color="auto" w:fill="FAFBFC"/>
         <w:spacing w:before="0" w:beforeAutospacing="0" w:after="0" w:afterAutospacing="0"/>
         <w:rPr>
@@ -757,7 +757,7 @@
       </w:pPr>
       <w:r>
         <w:rPr>
-          <w:rStyle w:val="Enfasigrassetto"/>
+          <w:rStyle w:val="Strong"/>
           <w:rFonts w:ascii="Arial" w:hAnsi="Arial" w:cs="Arial"/>
           <w:color w:val="6B7280"/>
           <w:sz w:val="27"/>
@@ -785,7 +785,7 @@
       </w:r>
       <w:r>
         <w:rPr>
-          <w:rStyle w:val="Enfasigrassetto"/>
+          <w:rStyle w:val="Strong"/>
           <w:rFonts w:ascii="Arial" w:hAnsi="Arial" w:cs="Arial"/>
           <w:color w:val="6B7280"/>
           <w:sz w:val="27"/>
@@ -813,7 +813,7 @@
       </w:r>
       <w:r>
         <w:rPr>
-          <w:rStyle w:val="Enfasigrassetto"/>
+          <w:rStyle w:val="Strong"/>
           <w:rFonts w:ascii="Arial" w:hAnsi="Arial" w:cs="Arial"/>
           <w:color w:val="6B7280"/>
           <w:sz w:val="27"/>
@@ -841,7 +841,7 @@
       </w:r>
       <w:r>
         <w:rPr>
-          <w:rStyle w:val="Enfasigrassetto"/>
+          <w:rStyle w:val="Strong"/>
           <w:rFonts w:ascii="Arial" w:hAnsi="Arial" w:cs="Arial"/>
           <w:color w:val="6B7280"/>
           <w:sz w:val="27"/>
@@ -869,7 +869,7 @@
       </w:r>
       <w:r>
         <w:rPr>
-          <w:rStyle w:val="Enfasigrassetto"/>
+          <w:rStyle w:val="Strong"/>
           <w:rFonts w:ascii="Arial" w:hAnsi="Arial" w:cs="Arial"/>
           <w:color w:val="6B7280"/>
           <w:sz w:val="27"/>
@@ -889,7 +889,7 @@
     </w:p>
     <w:p>
       <w:pPr>
-        <w:pStyle w:val="NormaleWeb"/>
+        <w:pStyle w:val="NormalWeb"/>
         <w:shd w:val="clear" w:color="auto" w:fill="FAFBFC"/>
         <w:spacing w:before="0" w:beforeAutospacing="0" w:after="225" w:afterAutospacing="0"/>
         <w:rPr>
@@ -920,7 +920,7 @@
     </w:p>
     <w:p>
       <w:pPr>
-        <w:pStyle w:val="Titolo4"/>
+        <w:pStyle w:val="Heading4"/>
         <w:spacing w:before="0" w:after="150"/>
         <w:jc w:val="center"/>
         <w:rPr>
@@ -953,7 +953,7 @@
     </w:p>
     <w:p>
       <w:pPr>
-        <w:pStyle w:val="Titolo4"/>
+        <w:pStyle w:val="Heading4"/>
         <w:spacing w:before="0" w:after="150"/>
         <w:jc w:val="center"/>
         <w:rPr>
@@ -971,7 +971,7 @@
     </w:p>
     <w:p>
       <w:pPr>
-        <w:pStyle w:val="NormaleWeb"/>
+        <w:pStyle w:val="NormalWeb"/>
         <w:spacing w:before="0" w:beforeAutospacing="0" w:after="0" w:afterAutospacing="0"/>
         <w:jc w:val="center"/>
         <w:rPr>
@@ -981,7 +981,7 @@
       </w:pPr>
       <w:r>
         <w:rPr>
-          <w:rStyle w:val="Enfasigrassetto"/>
+          <w:rStyle w:val="Strong"/>
           <w:rFonts w:ascii="Arial" w:hAnsi="Arial" w:cs="Arial"/>
           <w:color w:val="FF0000"/>
         </w:rPr>
@@ -1020,7 +1020,7 @@
       </w:r>
       <w:r>
         <w:rPr>
-          <w:rStyle w:val="Enfasigrassetto"/>
+          <w:rStyle w:val="Strong"/>
           <w:rFonts w:ascii="Arial" w:hAnsi="Arial" w:cs="Arial"/>
           <w:color w:val="FF0000"/>
         </w:rPr>
@@ -1042,7 +1042,7 @@
       </w:r>
       <w:r>
         <w:rPr>
-          <w:rStyle w:val="Enfasigrassetto"/>
+          <w:rStyle w:val="Strong"/>
           <w:rFonts w:ascii="Arial" w:hAnsi="Arial" w:cs="Arial"/>
           <w:color w:val="FF0000"/>
         </w:rPr>
@@ -1066,7 +1066,7 @@
     </w:p>
     <w:p>
       <w:pPr>
-        <w:pStyle w:val="Titolo3"/>
+        <w:pStyle w:val="Heading3"/>
         <w:shd w:val="clear" w:color="auto" w:fill="FAFBFC"/>
         <w:spacing w:before="0" w:beforeAutospacing="0" w:after="300" w:afterAutospacing="0"/>
         <w:rPr>
@@ -1102,7 +1102,7 @@
     </w:p>
     <w:p>
       <w:pPr>
-        <w:pStyle w:val="Titolo3"/>
+        <w:pStyle w:val="Heading3"/>
         <w:shd w:val="clear" w:color="auto" w:fill="FFFFFF"/>
         <w:spacing w:before="0" w:beforeAutospacing="0" w:after="300" w:afterAutospacing="0"/>
         <w:rPr>
@@ -1120,7 +1120,7 @@
     </w:p>
     <w:p>
       <w:pPr>
-        <w:pStyle w:val="Titolo3"/>
+        <w:pStyle w:val="Heading3"/>
         <w:shd w:val="clear" w:color="auto" w:fill="FFFFFF"/>
         <w:spacing w:before="0" w:beforeAutospacing="0" w:after="300" w:afterAutospacing="0"/>
         <w:rPr>
@@ -1210,7 +1210,7 @@
     </w:p>
     <w:p>
       <w:pPr>
-        <w:pStyle w:val="Titolo2"/>
+        <w:pStyle w:val="Heading2"/>
         <w:shd w:val="clear" w:color="auto" w:fill="FAFBFC"/>
         <w:spacing w:before="0" w:after="360"/>
         <w:jc w:val="center"/>
@@ -1265,7 +1265,7 @@
     </w:p>
     <w:p>
       <w:pPr>
-        <w:pStyle w:val="NormaleWeb"/>
+        <w:pStyle w:val="NormalWeb"/>
         <w:shd w:val="clear" w:color="auto" w:fill="FAFBFC"/>
         <w:spacing w:before="0" w:beforeAutospacing="0" w:after="600" w:afterAutospacing="0"/>
         <w:jc w:val="center"/>
@@ -1427,7 +1427,7 @@
     </w:p>
     <w:p>
       <w:pPr>
-        <w:pStyle w:val="Paragrafoelenco"/>
+        <w:pStyle w:val="ListParagraph"/>
         <w:rPr>
           <w:b/>
           <w:bCs/>
@@ -1443,7 +1443,7 @@
     </w:p>
     <w:p>
       <w:pPr>
-        <w:pStyle w:val="Paragrafoelenco"/>
+        <w:pStyle w:val="ListParagraph"/>
         <w:rPr>
           <w:b/>
           <w:bCs/>
@@ -1459,16 +1459,16 @@
     </w:p>
     <w:p>
       <w:pPr>
-        <w:pStyle w:val="Paragrafoelenco"/>
-        <w:rPr>
-          <w:b/>
-          <w:bCs/>
-        </w:rPr>
-      </w:pPr>
-    </w:p>
-    <w:p>
-      <w:pPr>
-        <w:pStyle w:val="Paragrafoelenco"/>
+        <w:pStyle w:val="ListParagraph"/>
+        <w:rPr>
+          <w:b/>
+          <w:bCs/>
+        </w:rPr>
+      </w:pPr>
+    </w:p>
+    <w:p>
+      <w:pPr>
+        <w:pStyle w:val="ListParagraph"/>
       </w:pPr>
       <w:r>
         <w:t>RIMANGONO:</w:t>
@@ -1476,12 +1476,12 @@
     </w:p>
     <w:p>
       <w:pPr>
-        <w:pStyle w:val="Paragrafoelenco"/>
-      </w:pPr>
-    </w:p>
-    <w:p>
-      <w:pPr>
-        <w:pStyle w:val="Paragrafoelenco"/>
+        <w:pStyle w:val="ListParagraph"/>
+      </w:pPr>
+    </w:p>
+    <w:p>
+      <w:pPr>
+        <w:pStyle w:val="ListParagraph"/>
       </w:pPr>
       <w:r>
         <w:t>CAULONIA</w:t>
@@ -1489,7 +1489,7 @@
     </w:p>
     <w:p>
       <w:pPr>
-        <w:pStyle w:val="Paragrafoelenco"/>
+        <w:pStyle w:val="ListParagraph"/>
       </w:pPr>
       <w:r>
         <w:t>CIMINA’</w:t>
@@ -1497,7 +1497,7 @@
     </w:p>
     <w:p>
       <w:pPr>
-        <w:pStyle w:val="Paragrafoelenco"/>
+        <w:pStyle w:val="ListParagraph"/>
       </w:pPr>
       <w:r>
         <w:t>PLATI’</w:t>
@@ -1505,7 +1505,7 @@
     </w:p>
     <w:p>
       <w:pPr>
-        <w:pStyle w:val="Paragrafoelenco"/>
+        <w:pStyle w:val="ListParagraph"/>
       </w:pPr>
       <w:r>
         <w:t>RIACE</w:t>
@@ -1513,7 +1513,7 @@
     </w:p>
     <w:p>
       <w:pPr>
-        <w:pStyle w:val="Paragrafoelenco"/>
+        <w:pStyle w:val="ListParagraph"/>
       </w:pPr>
       <w:r>
         <w:t>ROCCELLA IONICA</w:t>
@@ -1521,7 +1521,7 @@
     </w:p>
     <w:p>
       <w:pPr>
-        <w:pStyle w:val="Paragrafoelenco"/>
+        <w:pStyle w:val="ListParagraph"/>
       </w:pPr>
       <w:r>
         <w:t>SIDERNO</w:t>
@@ -1547,11 +1547,38 @@
       <w:pPr>
         <w:ind w:left="360"/>
       </w:pPr>
-      <w:proofErr w:type="spellStart"/>
-      <w:r>
-        <w:t>casignana</w:t>
-      </w:r>
-      <w:proofErr w:type="spellEnd"/>
+      <w:r>
+        <w:t>C</w:t>
+      </w:r>
+      <w:r>
+        <w:t>asignana</w:t>
+      </w:r>
+    </w:p>
+    <w:p>
+      <w:pPr>
+        <w:ind w:left="360"/>
+      </w:pPr>
+      <w:r>
+        <w:t>Sant’Agata</w:t>
+      </w:r>
+    </w:p>
+    <w:p>
+      <w:pPr>
+        <w:ind w:left="360"/>
+      </w:pPr>
+    </w:p>
+    <w:p>
+      <w:pPr>
+        <w:ind w:left="360"/>
+      </w:pPr>
+    </w:p>
+    <w:p>
+      <w:pPr>
+        <w:ind w:left="360"/>
+      </w:pPr>
+      <w:r>
+        <w:t>MONASTERACE SOTTO ACQUA</w:t>
+      </w:r>
     </w:p>
     <w:p>
       <w:pPr>
@@ -1704,7 +1731,7 @@
 </file>
 
 <file path=word/numbering.xml><?xml version="1.0" encoding="utf-8"?>
-<w:numbering xmlns:wpc="http://schemas.microsoft.com/office/word/2010/wordprocessingCanvas" xmlns:cx="http://schemas.microsoft.com/office/drawing/2014/chartex" xmlns:cx1="http://schemas.microsoft.com/office/drawing/2015/9/8/chartex" xmlns:cx2="http://schemas.microsoft.com/office/drawing/2015/10/21/chartex" xmlns:cx3="http://schemas.microsoft.com/office/drawing/2016/5/9/chartex" xmlns:cx4="http://schemas.microsoft.com/office/drawing/2016/5/10/chartex" xmlns:cx5="http://schemas.microsoft.com/office/drawing/2016/5/11/chartex" xmlns:cx6="http://schemas.microsoft.com/office/drawing/2016/5/12/chartex" xmlns:cx7="http://schemas.microsoft.com/office/drawing/2016/5/13/chartex" xmlns:cx8="http://schemas.microsoft.com/office/drawing/2016/5/14/chartex" xmlns:mc="http://schemas.openxmlformats.org/markup-compatibility/2006" xmlns:aink="http://schemas.microsoft.com/office/drawing/2016/ink" xmlns:am3d="http://schemas.microsoft.com/office/drawing/2017/model3d" xmlns:o="urn:schemas-microsoft-com:office:office" xmlns:oel="http://schemas.microsoft.com/office/2019/extlst" xmlns:r="http://schemas.openxmlformats.org/officeDocument/2006/relationships" xmlns:m="http://schemas.openxmlformats.org/officeDocument/2006/math" xmlns:v="urn:schemas-microsoft-com:vml" xmlns:wp14="http://schemas.microsoft.com/office/word/2010/wordprocessingDrawing" xmlns:wp="http://schemas.openxmlformats.org/drawingml/2006/wordprocessingDrawing" xmlns:w10="urn:schemas-microsoft-com:office:word" xmlns:w="http://schemas.openxmlformats.org/wordprocessingml/2006/main" xmlns:w14="http://schemas.microsoft.com/office/word/2010/wordml" xmlns:w15="http://schemas.microsoft.com/office/word/2012/wordml" xmlns:w16cex="http://schemas.microsoft.com/office/word/2018/wordml/cex" xmlns:w16cid="http://schemas.microsoft.com/office/word/2016/wordml/cid" xmlns:w16="http://schemas.microsoft.com/office/word/2018/wordml" xmlns:w16sdtdh="http://schemas.microsoft.com/office/word/2020/wordml/sdtdatahash" xmlns:w16se="http://schemas.microsoft.com/office/word/2015/wordml/symex" xmlns:wpg="http://schemas.microsoft.com/office/word/2010/wordprocessingGroup" xmlns:wpi="http://schemas.microsoft.com/office/word/2010/wordprocessingInk" xmlns:wne="http://schemas.microsoft.com/office/word/2006/wordml" xmlns:wps="http://schemas.microsoft.com/office/word/2010/wordprocessingShape" mc:Ignorable="w14 w15 w16se w16cid w16 w16cex w16sdtdh wp14">
+<w:numbering xmlns:wpc="http://schemas.microsoft.com/office/word/2010/wordprocessingCanvas" xmlns:cx="http://schemas.microsoft.com/office/drawing/2014/chartex" xmlns:cx1="http://schemas.microsoft.com/office/drawing/2015/9/8/chartex" xmlns:cx2="http://schemas.microsoft.com/office/drawing/2015/10/21/chartex" xmlns:cx3="http://schemas.microsoft.com/office/drawing/2016/5/9/chartex" xmlns:cx4="http://schemas.microsoft.com/office/drawing/2016/5/10/chartex" xmlns:cx5="http://schemas.microsoft.com/office/drawing/2016/5/11/chartex" xmlns:cx6="http://schemas.microsoft.com/office/drawing/2016/5/12/chartex" xmlns:cx7="http://schemas.microsoft.com/office/drawing/2016/5/13/chartex" xmlns:cx8="http://schemas.microsoft.com/office/drawing/2016/5/14/chartex" xmlns:mc="http://schemas.openxmlformats.org/markup-compatibility/2006" xmlns:aink="http://schemas.microsoft.com/office/drawing/2016/ink" xmlns:am3d="http://schemas.microsoft.com/office/drawing/2017/model3d" xmlns:o="urn:schemas-microsoft-com:office:office" xmlns:oel="http://schemas.microsoft.com/office/2019/extlst" xmlns:r="http://schemas.openxmlformats.org/officeDocument/2006/relationships" xmlns:m="http://schemas.openxmlformats.org/officeDocument/2006/math" xmlns:v="urn:schemas-microsoft-com:vml" xmlns:wp14="http://schemas.microsoft.com/office/word/2010/wordprocessingDrawing" xmlns:wp="http://schemas.openxmlformats.org/drawingml/2006/wordprocessingDrawing" xmlns:w10="urn:schemas-microsoft-com:office:word" xmlns:w="http://schemas.openxmlformats.org/wordprocessingml/2006/main" xmlns:w14="http://schemas.microsoft.com/office/word/2010/wordml" xmlns:w15="http://schemas.microsoft.com/office/word/2012/wordml" xmlns:w16cex="http://schemas.microsoft.com/office/word/2018/wordml/cex" xmlns:w16cid="http://schemas.microsoft.com/office/word/2016/wordml/cid" xmlns:w16="http://schemas.microsoft.com/office/word/2018/wordml" xmlns:w16du="http://schemas.microsoft.com/office/word/2023/wordml/word16du" xmlns:w16sdtdh="http://schemas.microsoft.com/office/word/2020/wordml/sdtdatahash" xmlns:w16sdtfl="http://schemas.microsoft.com/office/word/2024/wordml/sdtformatlock" xmlns:w16se="http://schemas.microsoft.com/office/word/2015/wordml/symex" xmlns:wpg="http://schemas.microsoft.com/office/word/2010/wordprocessingGroup" xmlns:wpi="http://schemas.microsoft.com/office/word/2010/wordprocessingInk" xmlns:wne="http://schemas.microsoft.com/office/word/2006/wordml" xmlns:wps="http://schemas.microsoft.com/office/word/2010/wordprocessingShape" mc:Ignorable="w14 w15 w16se w16cid w16 w16cex w16sdtdh w16sdtfl w16du wp14">
   <w:abstractNum w:abstractNumId="0" w15:restartNumberingAfterBreak="0">
     <w:nsid w:val="1B500148"/>
     <w:multiLevelType w:val="hybridMultilevel"/>
@@ -1913,7 +1940,7 @@
 </file>
 
 <file path=word/styles.xml><?xml version="1.0" encoding="utf-8"?>
-<w:styles xmlns:mc="http://schemas.openxmlformats.org/markup-compatibility/2006" xmlns:r="http://schemas.openxmlformats.org/officeDocument/2006/relationships" xmlns:w="http://schemas.openxmlformats.org/wordprocessingml/2006/main" xmlns:w14="http://schemas.microsoft.com/office/word/2010/wordml" xmlns:w15="http://schemas.microsoft.com/office/word/2012/wordml" xmlns:w16cex="http://schemas.microsoft.com/office/word/2018/wordml/cex" xmlns:w16cid="http://schemas.microsoft.com/office/word/2016/wordml/cid" xmlns:w16="http://schemas.microsoft.com/office/word/2018/wordml" xmlns:w16sdtdh="http://schemas.microsoft.com/office/word/2020/wordml/sdtdatahash" xmlns:w16se="http://schemas.microsoft.com/office/word/2015/wordml/symex" mc:Ignorable="w14 w15 w16se w16cid w16 w16cex w16sdtdh">
+<w:styles xmlns:mc="http://schemas.openxmlformats.org/markup-compatibility/2006" xmlns:r="http://schemas.openxmlformats.org/officeDocument/2006/relationships" xmlns:w="http://schemas.openxmlformats.org/wordprocessingml/2006/main" xmlns:w14="http://schemas.microsoft.com/office/word/2010/wordml" xmlns:w15="http://schemas.microsoft.com/office/word/2012/wordml" xmlns:w16cex="http://schemas.microsoft.com/office/word/2018/wordml/cex" xmlns:w16cid="http://schemas.microsoft.com/office/word/2016/wordml/cid" xmlns:w16="http://schemas.microsoft.com/office/word/2018/wordml" xmlns:w16du="http://schemas.microsoft.com/office/word/2023/wordml/word16du" xmlns:w16sdtdh="http://schemas.microsoft.com/office/word/2020/wordml/sdtdatahash" xmlns:w16sdtfl="http://schemas.microsoft.com/office/word/2024/wordml/sdtformatlock" xmlns:w16se="http://schemas.microsoft.com/office/word/2015/wordml/symex" mc:Ignorable="w14 w15 w16se w16cid w16 w16cex w16sdtdh w16sdtfl w16du">
   <w:docDefaults>
     <w:rPrDefault>
       <w:rPr>
@@ -2305,15 +2332,15 @@
     <w:lsdException w:name="Unresolved Mention" w:semiHidden="1" w:unhideWhenUsed="1"/>
     <w:lsdException w:name="Smart Link" w:semiHidden="1" w:unhideWhenUsed="1"/>
   </w:latentStyles>
-  <w:style w:type="paragraph" w:default="1" w:styleId="Normale">
+  <w:style w:type="paragraph" w:default="1" w:styleId="Normal">
     <w:name w:val="Normal"/>
     <w:qFormat/>
   </w:style>
-  <w:style w:type="paragraph" w:styleId="Titolo2">
+  <w:style w:type="paragraph" w:styleId="Heading2">
     <w:name w:val="heading 2"/>
-    <w:basedOn w:val="Normale"/>
-    <w:next w:val="Normale"/>
-    <w:link w:val="Titolo2Carattere"/>
+    <w:basedOn w:val="Normal"/>
+    <w:next w:val="Normal"/>
+    <w:link w:val="Heading2Char"/>
     <w:uiPriority w:val="9"/>
     <w:semiHidden/>
     <w:unhideWhenUsed/>
@@ -2332,10 +2359,10 @@
       <w:szCs w:val="26"/>
     </w:rPr>
   </w:style>
-  <w:style w:type="paragraph" w:styleId="Titolo3">
+  <w:style w:type="paragraph" w:styleId="Heading3">
     <w:name w:val="heading 3"/>
-    <w:basedOn w:val="Normale"/>
-    <w:link w:val="Titolo3Carattere"/>
+    <w:basedOn w:val="Normal"/>
+    <w:link w:val="Heading3Char"/>
     <w:uiPriority w:val="9"/>
     <w:qFormat/>
     <w:rsid w:val="00D44BAA"/>
@@ -2354,11 +2381,11 @@
       <w14:ligatures w14:val="none"/>
     </w:rPr>
   </w:style>
-  <w:style w:type="paragraph" w:styleId="Titolo4">
+  <w:style w:type="paragraph" w:styleId="Heading4">
     <w:name w:val="heading 4"/>
-    <w:basedOn w:val="Normale"/>
-    <w:next w:val="Normale"/>
-    <w:link w:val="Titolo4Carattere"/>
+    <w:basedOn w:val="Normal"/>
+    <w:next w:val="Normal"/>
+    <w:link w:val="Heading4Char"/>
     <w:uiPriority w:val="9"/>
     <w:semiHidden/>
     <w:unhideWhenUsed/>
@@ -2377,13 +2404,13 @@
       <w:color w:val="2F5496" w:themeColor="accent1" w:themeShade="BF"/>
     </w:rPr>
   </w:style>
-  <w:style w:type="character" w:default="1" w:styleId="Carpredefinitoparagrafo">
+  <w:style w:type="character" w:default="1" w:styleId="DefaultParagraphFont">
     <w:name w:val="Default Paragraph Font"/>
     <w:uiPriority w:val="1"/>
     <w:semiHidden/>
     <w:unhideWhenUsed/>
   </w:style>
-  <w:style w:type="table" w:default="1" w:styleId="Tabellanormale">
+  <w:style w:type="table" w:default="1" w:styleId="TableNormal">
     <w:name w:val="Normal Table"/>
     <w:uiPriority w:val="99"/>
     <w:semiHidden/>
@@ -2398,15 +2425,15 @@
       </w:tblCellMar>
     </w:tblPr>
   </w:style>
-  <w:style w:type="numbering" w:default="1" w:styleId="Nessunelenco">
+  <w:style w:type="numbering" w:default="1" w:styleId="NoList">
     <w:name w:val="No List"/>
     <w:uiPriority w:val="99"/>
     <w:semiHidden/>
     <w:unhideWhenUsed/>
   </w:style>
-  <w:style w:type="paragraph" w:styleId="Paragrafoelenco">
+  <w:style w:type="paragraph" w:styleId="ListParagraph">
     <w:name w:val="List Paragraph"/>
-    <w:basedOn w:val="Normale"/>
+    <w:basedOn w:val="Normal"/>
     <w:uiPriority w:val="34"/>
     <w:qFormat/>
     <w:rsid w:val="005A3AEE"/>
@@ -2415,10 +2442,10 @@
       <w:contextualSpacing/>
     </w:pPr>
   </w:style>
-  <w:style w:type="character" w:customStyle="1" w:styleId="Titolo3Carattere">
-    <w:name w:val="Titolo 3 Carattere"/>
-    <w:basedOn w:val="Carpredefinitoparagrafo"/>
-    <w:link w:val="Titolo3"/>
+  <w:style w:type="character" w:customStyle="1" w:styleId="Heading3Char">
+    <w:name w:val="Heading 3 Char"/>
+    <w:basedOn w:val="DefaultParagraphFont"/>
+    <w:link w:val="Heading3"/>
     <w:uiPriority w:val="9"/>
     <w:rsid w:val="00D44BAA"/>
     <w:rPr>
@@ -2432,9 +2459,9 @@
       <w14:ligatures w14:val="none"/>
     </w:rPr>
   </w:style>
-  <w:style w:type="paragraph" w:styleId="NormaleWeb">
+  <w:style w:type="paragraph" w:styleId="NormalWeb">
     <w:name w:val="Normal (Web)"/>
-    <w:basedOn w:val="Normale"/>
+    <w:basedOn w:val="Normal"/>
     <w:uiPriority w:val="99"/>
     <w:semiHidden/>
     <w:unhideWhenUsed/>
@@ -2449,9 +2476,9 @@
       <w14:ligatures w14:val="none"/>
     </w:rPr>
   </w:style>
-  <w:style w:type="character" w:styleId="Enfasigrassetto">
+  <w:style w:type="character" w:styleId="Strong">
     <w:name w:val="Strong"/>
-    <w:basedOn w:val="Carpredefinitoparagrafo"/>
+    <w:basedOn w:val="DefaultParagraphFont"/>
     <w:uiPriority w:val="22"/>
     <w:qFormat/>
     <w:rsid w:val="00A54F5F"/>
@@ -2460,10 +2487,10 @@
       <w:bCs/>
     </w:rPr>
   </w:style>
-  <w:style w:type="character" w:customStyle="1" w:styleId="Titolo4Carattere">
-    <w:name w:val="Titolo 4 Carattere"/>
-    <w:basedOn w:val="Carpredefinitoparagrafo"/>
-    <w:link w:val="Titolo4"/>
+  <w:style w:type="character" w:customStyle="1" w:styleId="Heading4Char">
+    <w:name w:val="Heading 4 Char"/>
+    <w:basedOn w:val="DefaultParagraphFont"/>
+    <w:link w:val="Heading4"/>
     <w:uiPriority w:val="9"/>
     <w:semiHidden/>
     <w:rsid w:val="00A54F5F"/>
@@ -2474,10 +2501,10 @@
       <w:color w:val="2F5496" w:themeColor="accent1" w:themeShade="BF"/>
     </w:rPr>
   </w:style>
-  <w:style w:type="character" w:customStyle="1" w:styleId="Titolo2Carattere">
-    <w:name w:val="Titolo 2 Carattere"/>
-    <w:basedOn w:val="Carpredefinitoparagrafo"/>
-    <w:link w:val="Titolo2"/>
+  <w:style w:type="character" w:customStyle="1" w:styleId="Heading2Char">
+    <w:name w:val="Heading 2 Char"/>
+    <w:basedOn w:val="DefaultParagraphFont"/>
+    <w:link w:val="Heading2"/>
     <w:uiPriority w:val="9"/>
     <w:semiHidden/>
     <w:rsid w:val="00C06C8D"/>

</xml_diff>